<commit_message>
Update daily headband calibration workflow
</commit_message>
<xml_diff>
--- a/docs/头环四鱼眼相机标定采集流程_内置SD卡版_日常快速启动版本终版.docx
+++ b/docs/头环四鱼眼相机标定采集流程_内置SD卡版_日常快速启动版本终版.docx
@@ -1551,6 +1551,28 @@
         </w:rPr>
         <w:t>。</w:t>
       </w:r>
+      <w:r>
+        <w:rPr>
+          <w:rFonts w:eastAsia="等线" w:ascii="Arial" w:cs="Arial" w:hAnsi="Arial"/>
+          <w:sz w:val="22"/>
+        </w:rPr>
+        <w:t xml:space="preserve"> 仅当第 3 步出现 </w:t>
+      </w:r>
+      <w:r>
+        <w:rPr>
+          <w:rFonts w:eastAsia="Consolas" w:ascii="Consolas" w:cs="Consolas" w:hAnsi="Consolas"/>
+          <w:sz w:val="22"/>
+          <w:shd w:fill="EFF0F1"/>
+        </w:rPr>
+        <w:t>REMOTE HOST IDENTIFICATION HAS CHANGED</w:t>
+      </w:r>
+      <w:r>
+        <w:rPr>
+          <w:rFonts w:eastAsia="等线" w:ascii="Arial" w:cs="Arial" w:hAnsi="Arial"/>
+          <w:sz w:val="22"/>
+        </w:rPr>
+        <w:t xml:space="preserve"> 时执行本节。不同头环可能被分配到相同 IP，工作站因此保留了上一台设备的 SSH 密钥。</w:t>
+      </w:r>
     </w:p>
     <w:p>
       <w:pPr>
@@ -1563,7 +1585,7 @@
           <w:rFonts w:eastAsia="等线" w:ascii="Arial" w:cs="Arial" w:hAnsi="Arial"/>
           <w:sz w:val="22"/>
         </w:rPr>
-        <w:t xml:space="preserve">**出现条件：**更换了新头环，但路由器又给它分配了旧 IP；SSH 出现 </w:t>
+        <w:t xml:space="preserve">**先核对身份：**确认第 1 步 </w:t>
       </w:r>
       <w:r>
         <w:rPr>
@@ -1571,22 +1593,14 @@
           <w:sz w:val="22"/>
           <w:shd w:fill="EFF0F1"/>
         </w:rPr>
-        <w:t>REMOTE HOST IDENTIFICATION HAS CHANGED</w:t>
-      </w:r>
-      <w:r>
-        <w:rPr>
-          <w:rFonts w:eastAsia="等线" w:ascii="Arial" w:cs="Arial" w:hAnsi="Arial"/>
-          <w:sz w:val="22"/>
-        </w:rPr>
-        <w:t>。</w:t>
-        <w:br/>
-      </w:r>
-      <w:r>
-        <w:rPr>
-          <w:rFonts w:eastAsia="等线" w:ascii="Arial" w:cs="Arial" w:hAnsi="Arial"/>
-          <w:sz w:val="22"/>
-        </w:rPr>
-        <w:t xml:space="preserve"> **前提：**确认旧头环已经断开，只剩当前这台新头环接入网络。</w:t>
+        <w:t>arp-scan</w:t>
+      </w:r>
+      <w:r>
+        <w:rPr>
+          <w:rFonts w:eastAsia="等线" w:ascii="Arial" w:cs="Arial" w:hAnsi="Arial"/>
+          <w:sz w:val="22"/>
+        </w:rPr>
+        <w:t xml:space="preserve"> 查到的是当前头环的 IP，并将 SSH 警告中显示的 ED25519 指纹，与当前头环本地终端或可信设备记录中的指纹核对。只确认旧头环已断开还不够。若指纹无法核对或不一致，先停止连接。</w:t>
       </w:r>
     </w:p>
     <w:tbl>
@@ -1637,7 +1651,15 @@
                 <w:rFonts w:eastAsia="Consolas" w:ascii="Consolas" w:cs="Consolas" w:hAnsi="Consolas"/>
                 <w:sz w:val="22"/>
               </w:rPr>
-              <w:t>ssh-keygen -f "/home/key/.ssh/known_hosts" -R "192.168.10.109"</w:t>
+              <w:t># 头环本地终端：需要核对新头环指纹时执行，记下输出的 SHA256 指纹</w:t>
+              <w:br/>
+            </w:r>
+            <w:r>
+              <w:rPr>
+                <w:rFonts w:eastAsia="Consolas" w:ascii="Consolas" w:cs="Consolas" w:hAnsi="Consolas"/>
+                <w:sz w:val="22"/>
+              </w:rPr>
+              <w:t>sudo ssh-keygen -lf /etc/ssh/ssh_host_ed25519_key.pub</w:t>
             </w:r>
           </w:p>
         </w:tc>
@@ -1654,59 +1676,22 @@
           <w:rFonts w:eastAsia="等线" w:ascii="Arial" w:cs="Arial" w:hAnsi="Arial"/>
           <w:sz w:val="22"/>
         </w:rPr>
-        <w:t xml:space="preserve">**注释：**删除 Linux 中保存的“旧头环 </w:t>
-      </w:r>
-      <w:r>
-        <w:rPr>
-          <w:rFonts w:eastAsia="Consolas" w:ascii="Consolas" w:cs="Consolas" w:hAnsi="Consolas"/>
-          <w:sz w:val="22"/>
-          <w:shd w:fill="EFF0F1"/>
-        </w:rPr>
-        <w:t>.109</w:t>
-      </w:r>
-      <w:r>
-        <w:rPr>
-          <w:rFonts w:eastAsia="等线" w:ascii="Arial" w:cs="Arial" w:hAnsi="Arial"/>
-          <w:sz w:val="22"/>
-        </w:rPr>
-        <w:t xml:space="preserve"> 的 SSH 身份记录”。</w:t>
-        <w:br/>
-      </w:r>
-      <w:r>
-        <w:rPr>
-          <w:rFonts w:eastAsia="等线" w:ascii="Arial" w:cs="Arial" w:hAnsi="Arial"/>
-          <w:sz w:val="22"/>
-        </w:rPr>
-        <w:t xml:space="preserve"> **每次需要修改：**仅把最后的 </w:t>
-      </w:r>
-      <w:r>
-        <w:rPr>
-          <w:rFonts w:eastAsia="Consolas" w:ascii="Consolas" w:cs="Consolas" w:hAnsi="Consolas"/>
-          <w:sz w:val="22"/>
-          <w:shd w:fill="EFF0F1"/>
-        </w:rPr>
-        <w:t>192.168.10.109</w:t>
-      </w:r>
-      <w:r>
-        <w:rPr>
-          <w:rFonts w:eastAsia="等线" w:ascii="Arial" w:cs="Arial" w:hAnsi="Arial"/>
-          <w:sz w:val="22"/>
-        </w:rPr>
-        <w:t xml:space="preserve"> 改成 arp-scan 扫描到的当前头环 IP。</w:t>
-      </w:r>
-    </w:p>
-    <w:p>
-      <w:pPr>
-        <w:spacing w:before="120" w:after="120" w:line="288" w:lineRule="auto"/>
-        <w:ind w:left="0"/>
-        <w:jc w:val="left"/>
-      </w:pPr>
-      <w:r>
-        <w:rPr>
-          <w:rFonts w:eastAsia="等线" w:ascii="Arial" w:cs="Arial" w:hAnsi="Arial"/>
-          <w:sz w:val="22"/>
-        </w:rPr>
-        <w:t>然后重新连接头环：</w:t>
+        <w:t xml:space="preserve">核对一致后，在 </w:t>
+      </w:r>
+      <w:r>
+        <w:rPr>
+          <w:rFonts w:eastAsia="等线" w:ascii="Arial" w:cs="Arial" w:hAnsi="Arial"/>
+          <w:b w:val="true"/>
+          <w:sz w:val="22"/>
+        </w:rPr>
+        <w:t>Linux 工作站</w:t>
+      </w:r>
+      <w:r>
+        <w:rPr>
+          <w:rFonts w:eastAsia="等线" w:ascii="Arial" w:cs="Arial" w:hAnsi="Arial"/>
+          <w:sz w:val="22"/>
+        </w:rPr>
+        <w:t>执行：</w:t>
       </w:r>
     </w:p>
     <w:tbl>
@@ -1757,7 +1742,25 @@
                 <w:rFonts w:eastAsia="Consolas" w:ascii="Consolas" w:cs="Consolas" w:hAnsi="Consolas"/>
                 <w:sz w:val="22"/>
               </w:rPr>
-              <w:t>ssh orangepi@192.168.10.109</w:t>
+              <w:t># 【每次要改】只修改这里：填入第 1 步 arp-scan 查到的当前头环 IP</w:t>
+              <w:br/>
+              <w:t>HEADBAND_IP="192.168.10.109"</w:t>
+              <w:br/>
+              <w:br/>
+              <w:t># 删除工作站中这个 IP 对应的旧 SSH 身份记录</w:t>
+              <w:br/>
+              <w:t>ssh-keygen -f "$HOME/.ssh/known_hosts" -R "$HEADBAND_IP"</w:t>
+              <w:br/>
+              <w:br/>
+              <w:t># 重新连接；再次核对屏幕显示的指纹，一致才输入 yes</w:t>
+              <w:br/>
+            </w:r>
+            <w:r>
+              <w:rPr>
+                <w:rFonts w:eastAsia="Consolas" w:ascii="Consolas" w:cs="Consolas" w:hAnsi="Consolas"/>
+                <w:sz w:val="22"/>
+              </w:rPr>
+              <w:t>ssh "orangepi@$HEADBAND_IP"</w:t>
             </w:r>
           </w:p>
         </w:tc>
@@ -1774,7 +1777,7 @@
           <w:rFonts w:eastAsia="等线" w:ascii="Arial" w:cs="Arial" w:hAnsi="Arial"/>
           <w:sz w:val="22"/>
         </w:rPr>
-        <w:t xml:space="preserve">**注释：**首次连接会询问是否信任新头环的身份密钥；确认当前只有这台头环在线后，输入 </w:t>
+        <w:t xml:space="preserve">成功进入头环后，输入 </w:t>
       </w:r>
       <w:r>
         <w:rPr>
@@ -1782,14 +1785,29 @@
           <w:sz w:val="22"/>
           <w:shd w:fill="EFF0F1"/>
         </w:rPr>
-        <w:t>yes</w:t>
-      </w:r>
-      <w:r>
-        <w:rPr>
-          <w:rFonts w:eastAsia="等线" w:ascii="Arial" w:cs="Arial" w:hAnsi="Arial"/>
-          <w:sz w:val="22"/>
-        </w:rPr>
-        <w:t xml:space="preserve">，再输入头环密码。成功进入后输入 </w:t>
+        <w:t>exit</w:t>
+      </w:r>
+      <w:r>
+        <w:rPr>
+          <w:rFonts w:eastAsia="等线" w:ascii="Arial" w:cs="Arial" w:hAnsi="Arial"/>
+          <w:sz w:val="22"/>
+        </w:rPr>
+        <w:t xml:space="preserve"> 返回 Linux 工作站，</w:t>
+      </w:r>
+      <w:r>
+        <w:rPr>
+          <w:rFonts w:eastAsia="等线" w:ascii="Arial" w:cs="Arial" w:hAnsi="Arial"/>
+          <w:b w:val="true"/>
+          <w:sz w:val="22"/>
+        </w:rPr>
+        <w:t>重新执行第 3 步</w:t>
+      </w:r>
+      <w:r>
+        <w:rPr>
+          <w:rFonts w:eastAsia="等线" w:ascii="Arial" w:cs="Arial" w:hAnsi="Arial"/>
+          <w:sz w:val="22"/>
+        </w:rPr>
+        <w:t xml:space="preserve">，确认服务为 </w:t>
       </w:r>
       <w:r>
         <w:rPr>
@@ -1797,14 +1815,44 @@
           <w:sz w:val="22"/>
           <w:shd w:fill="EFF0F1"/>
         </w:rPr>
-        <w:t>exit</w:t>
-      </w:r>
-      <w:r>
-        <w:rPr>
-          <w:rFonts w:eastAsia="等线" w:ascii="Arial" w:cs="Arial" w:hAnsi="Arial"/>
-          <w:sz w:val="22"/>
-        </w:rPr>
-        <w:t xml:space="preserve"> 回到 Linux，即可继续执行四路相机检查。</w:t>
+        <w:t>active</w:t>
+      </w:r>
+      <w:r>
+        <w:rPr>
+          <w:rFonts w:eastAsia="等线" w:ascii="Arial" w:cs="Arial" w:hAnsi="Arial"/>
+          <w:sz w:val="22"/>
+        </w:rPr>
+        <w:t xml:space="preserve"> 且四路均为 </w:t>
+      </w:r>
+      <w:r>
+        <w:rPr>
+          <w:rFonts w:eastAsia="Consolas" w:ascii="Consolas" w:cs="Consolas" w:hAnsi="Consolas"/>
+          <w:sz w:val="22"/>
+          <w:shd w:fill="EFF0F1"/>
+        </w:rPr>
+        <w:t>PASS</w:t>
+      </w:r>
+      <w:r>
+        <w:rPr>
+          <w:rFonts w:eastAsia="等线" w:ascii="Arial" w:cs="Arial" w:hAnsi="Arial"/>
+          <w:sz w:val="22"/>
+        </w:rPr>
+        <w:t xml:space="preserve">，再继续第 4 步。以后 IP 变化时，只修改 </w:t>
+      </w:r>
+      <w:r>
+        <w:rPr>
+          <w:rFonts w:eastAsia="Consolas" w:ascii="Consolas" w:cs="Consolas" w:hAnsi="Consolas"/>
+          <w:sz w:val="22"/>
+          <w:shd w:fill="EFF0F1"/>
+        </w:rPr>
+        <w:t>HEADBAND_IP</w:t>
+      </w:r>
+      <w:r>
+        <w:rPr>
+          <w:rFonts w:eastAsia="等线" w:ascii="Arial" w:cs="Arial" w:hAnsi="Arial"/>
+          <w:sz w:val="22"/>
+        </w:rPr>
+        <w:t xml:space="preserve"> 那一行。</w:t>
       </w:r>
     </w:p>
     <w:p>
@@ -2234,7 +2282,7 @@
                       <w:sz w:val="22"/>
                       <w:shd w:fill="f76964"/>
                     </w:rPr>
-                    <w:t>camera_cs0001_1010_1600.bag</w:t>
+                    <w:t>camera_cp0008_1013_1710.bag</w:t>
                   </w:r>
                   <w:r>
                     <w:rPr>
@@ -2587,7 +2635,7 @@
                       <w:sz w:val="22"/>
                       <w:shd w:fill="f76964"/>
                     </w:rPr>
-                    <w:t>camera_cs0001_1010_1600.bag</w:t>
+                    <w:t>camera_cp0008_1013_1710.bag</w:t>
                   </w:r>
                   <w:r>
                     <w:rPr>
@@ -2610,7 +2658,7 @@
                       <w:sz w:val="22"/>
                       <w:shd w:fill="f76964"/>
                     </w:rPr>
-                    <w:t>cs-0001</w:t>
+                    <w:t>cp-0008</w:t>
                   </w:r>
                   <w:r>
                     <w:rPr>
@@ -2639,7 +2687,15 @@
                       <w:rFonts w:eastAsia="Consolas" w:ascii="Consolas" w:cs="Consolas" w:hAnsi="Consolas"/>
                       <w:sz w:val="22"/>
                     </w:rPr>
-                    <w:t>:/media/orangepi/sdcard/data/kalibr_bags/"$BAG_NAME" /home/key/文档/kalibr/data/live_bags/</w:t>
+                    <w:t xml:space="preserve">:/media/orangepi/sdcard/data/kalibr_bags/"$BAG_NAME" </w:t>
+                  </w:r>
+                  <w:r>
+                    <w:rPr>
+                      <w:rFonts w:eastAsia="Consolas" w:ascii="Consolas" w:cs="Consolas" w:hAnsi="Consolas"/>
+                      <w:sz w:val="22"/>
+                      <w:shd w:fill="f76964"/>
+                    </w:rPr>
+                    <w:t>/home/key/文档/kalibr/data/cp=0008/</w:t>
                   </w:r>
                 </w:p>
               </w:tc>
@@ -2781,7 +2837,7 @@
                       <w:sz w:val="22"/>
                       <w:shd w:fill="f76964"/>
                     </w:rPr>
-                    <w:t>camera_cs0001_1010_1600.bag</w:t>
+                    <w:t>camera_cp0008_1013_1710.bag</w:t>
                   </w:r>
                   <w:r>
                     <w:rPr>
@@ -2813,15 +2869,51 @@
                     </w:rPr>
                     <w:t xml:space="preserve"> "sha256sum /media/orangepi/sdcard/data/kalibr_bags/$BAG_NAME"</w:t>
                     <w:br/>
-                    <w:t>sha256sum /home/key/文档/kalibr/data/live_bags/$BAG_NAME</w:t>
-                    <w:br/>
-                  </w:r>
-                  <w:r>
-                    <w:rPr>
-                      <w:rFonts w:eastAsia="Consolas" w:ascii="Consolas" w:cs="Consolas" w:hAnsi="Consolas"/>
-                      <w:sz w:val="22"/>
-                    </w:rPr>
-                    <w:t>docker exec kalibr bash -lc "source /opt/ros/noetic/setup.bash &amp;&amp; rosbag info /data/live_bags/$BAG_NAME"</w:t>
+                  </w:r>
+                  <w:r>
+                    <w:rPr>
+                      <w:rFonts w:eastAsia="Consolas" w:ascii="Consolas" w:cs="Consolas" w:hAnsi="Consolas"/>
+                      <w:sz w:val="22"/>
+                    </w:rPr>
+                    <w:t xml:space="preserve">sha256sum </w:t>
+                  </w:r>
+                  <w:r>
+                    <w:rPr>
+                      <w:rFonts w:eastAsia="Consolas" w:ascii="Consolas" w:cs="Consolas" w:hAnsi="Consolas"/>
+                      <w:sz w:val="22"/>
+                      <w:shd w:fill="f76964"/>
+                    </w:rPr>
+                    <w:t>/home/key/文档/kalibr/data/cp-0008</w:t>
+                  </w:r>
+                  <w:r>
+                    <w:rPr>
+                      <w:rFonts w:eastAsia="Consolas" w:ascii="Consolas" w:cs="Consolas" w:hAnsi="Consolas"/>
+                      <w:sz w:val="22"/>
+                    </w:rPr>
+                    <w:t>/$BAG_NAME</w:t>
+                    <w:br/>
+                  </w:r>
+                  <w:r>
+                    <w:rPr>
+                      <w:rFonts w:eastAsia="Consolas" w:ascii="Consolas" w:cs="Consolas" w:hAnsi="Consolas"/>
+                      <w:sz w:val="22"/>
+                    </w:rPr>
+                    <w:t>docker exec kalibr bash -lc "source /opt/ros/noetic/setup.bash &amp;&amp; rosbag info /</w:t>
+                  </w:r>
+                  <w:r>
+                    <w:rPr>
+                      <w:rFonts w:eastAsia="Consolas" w:ascii="Consolas" w:cs="Consolas" w:hAnsi="Consolas"/>
+                      <w:sz w:val="22"/>
+                      <w:shd w:fill="f76964"/>
+                    </w:rPr>
+                    <w:t>data/cp-0008</w:t>
+                  </w:r>
+                  <w:r>
+                    <w:rPr>
+                      <w:rFonts w:eastAsia="Consolas" w:ascii="Consolas" w:cs="Consolas" w:hAnsi="Consolas"/>
+                      <w:sz w:val="22"/>
+                    </w:rPr>
+                    <w:t>/$BAG_NAME"</w:t>
                   </w:r>
                 </w:p>
               </w:tc>
@@ -2976,20 +3068,97 @@
               <w:t>trap 'rc=$?; trap - EXIT; printf "\n脚本结束，退出码：%s\n" "$rc"; read -r -p "按回车关闭窗口..." _ || true; exit "$rc"' EXIT</w:t>
               <w:br/>
               <w:br/>
-              <w:t># ===== 每次测试新 BAG，只修改以下 3 行 =====</w:t>
-              <w:br/>
-              <w:t>DEVICE_DIR="cp-0001"  # 设备目录名，例如 cp-0002、cp-00016、cs-0001</w:t>
-              <w:br/>
-              <w:t>SOURCE_BAG="/home/key/文档/kalibr/data/cp-0001/camera/camera_cp0001_1011_2015.bag"  # 本次要测的第一步相机 BAG 完整路径</w:t>
-              <w:br/>
-              <w:t>BAG_FREQ_HZ="10.0"  # 抽帧频率；例如 10.0、5.0、2.0</w:t>
+              <w:t># ===== 每次测试新 BAG，只修改以下 4 行 =====</w:t>
+              <w:br/>
+            </w:r>
+            <w:r>
+              <w:rPr>
+                <w:rFonts w:eastAsia="Consolas" w:ascii="Consolas" w:cs="Consolas" w:hAnsi="Consolas"/>
+                <w:sz w:val="22"/>
+              </w:rPr>
+              <w:t>DEVICE_DIR="</w:t>
+            </w:r>
+            <w:r>
+              <w:rPr>
+                <w:rFonts w:eastAsia="Consolas" w:ascii="Consolas" w:cs="Consolas" w:hAnsi="Consolas"/>
+                <w:sz w:val="22"/>
+                <w:shd w:fill="f76964"/>
+              </w:rPr>
+              <w:t>cp-0008</w:t>
+            </w:r>
+            <w:r>
+              <w:rPr>
+                <w:rFonts w:eastAsia="Consolas" w:ascii="Consolas" w:cs="Consolas" w:hAnsi="Consolas"/>
+                <w:sz w:val="22"/>
+              </w:rPr>
+              <w:t>"  # 本次设备编号</w:t>
+              <w:br/>
+            </w:r>
+            <w:r>
+              <w:rPr>
+                <w:rFonts w:eastAsia="Consolas" w:ascii="Consolas" w:cs="Consolas" w:hAnsi="Consolas"/>
+                <w:sz w:val="22"/>
+              </w:rPr>
+              <w:t>SOURCE_BAG="</w:t>
+            </w:r>
+            <w:r>
+              <w:rPr>
+                <w:rFonts w:eastAsia="Consolas" w:ascii="Consolas" w:cs="Consolas" w:hAnsi="Consolas"/>
+                <w:sz w:val="22"/>
+                <w:shd w:fill="f76964"/>
+              </w:rPr>
+              <w:t>/home/key/文档/kalibr/data/cp-0008/camera_cp0008_1013_1710.bag</w:t>
+            </w:r>
+            <w:r>
+              <w:rPr>
+                <w:rFonts w:eastAsia="Consolas" w:ascii="Consolas" w:cs="Consolas" w:hAnsi="Consolas"/>
+                <w:sz w:val="22"/>
+              </w:rPr>
+              <w:t>"  # 原始 BAG 的绝对路径</w:t>
+              <w:br/>
+              <w:t>BAG_FREQ_HZ="10.0"  # 抽帧频率，例如 10.0、5.0、2.0</w:t>
+              <w:br/>
+            </w:r>
+            <w:r>
+              <w:rPr>
+                <w:rFonts w:eastAsia="Consolas" w:ascii="Consolas" w:cs="Consolas" w:hAnsi="Consolas"/>
+                <w:sz w:val="22"/>
+              </w:rPr>
+              <w:t>OUTPUT_ROOT="</w:t>
+            </w:r>
+            <w:r>
+              <w:rPr>
+                <w:rFonts w:eastAsia="Consolas" w:ascii="Consolas" w:cs="Consolas" w:hAnsi="Consolas"/>
+                <w:sz w:val="22"/>
+                <w:shd w:fill="f76964"/>
+              </w:rPr>
+              <w:t>/home/key/文档/kalibr/data/cp-0008</w:t>
+            </w:r>
+            <w:r>
+              <w:rPr>
+                <w:rFonts w:eastAsia="Consolas" w:ascii="Consolas" w:cs="Consolas" w:hAnsi="Consolas"/>
+                <w:sz w:val="22"/>
+              </w:rPr>
+              <w:t>"  # 结果保存的父目录，换设备时改这里</w:t>
               <w:br/>
               <w:t># ===========================================</w:t>
               <w:br/>
               <w:br/>
               <w:t>DATA_ROOT="/home/key/文档/kalibr/data"</w:t>
               <w:br/>
-              <w:t>TEST_ROOT="$DATA_ROOT/model_eval_ds_camera_20261012"</w:t>
+              <w:t>OUTPUT_ROOT="${OUTPUT_ROOT%/}"</w:t>
+              <w:br/>
+              <w:br/>
+              <w:t># 结果必须放在挂载给 Kalibr 容器的 data 目录内</w:t>
+              <w:br/>
+              <w:t>if [[ "$OUTPUT_ROOT" != "$DATA_ROOT" &amp;&amp; "$OUTPUT_ROOT" != "$DATA_ROOT/"* ]]; then</w:t>
+              <w:br/>
+              <w:t xml:space="preserve">  echo "结果目录必须位于 $DATA_ROOT 下：$OUTPUT_ROOT" &gt;&amp;2</w:t>
+              <w:br/>
+              <w:t xml:space="preserve">  exit 1</w:t>
+              <w:br/>
+              <w:t>fi</w:t>
+              <w:br/>
               <w:br/>
               <w:t>BAG_NAME="$(basename "$SOURCE_BAG")"</w:t>
               <w:br/>
@@ -2997,9 +3166,12 @@
               <w:br/>
               <w:t>RUN_TAG="ds-none_${BAG_FREQ_HZ}hz_$(date -u +%Y%m%dT%H%M%SZ)"</w:t>
               <w:br/>
-              <w:t>RUN_DIR="$TEST_ROOT/$DEVICE_DIR/$SAMPLE_ID/$RUN_TAG"</w:t>
-              <w:br/>
-              <w:t>RUN_DIR_INNER="/data/model_eval_ds_camera_20261012/$DEVICE_DIR/$SAMPLE_ID/$RUN_TAG"</w:t>
+              <w:t>RUN_DIR="$OUTPUT_ROOT/model_eval_ds_camera/$SAMPLE_ID/$RUN_TAG"</w:t>
+              <w:br/>
+              <w:br/>
+              <w:t># 自动把工作站路径映射成容器内路径；这里不用手动修改</w:t>
+              <w:br/>
+              <w:t>RUN_DIR_INNER="/data${RUN_DIR#"$DATA_ROOT"}"</w:t>
               <w:br/>
               <w:br/>
               <w:t>BASE_NAME="${BAG_NAME%.bag}"</w:t>
@@ -3015,7 +3187,7 @@
               <w:t>METADATA="$RUN_DIR/run_metadata.txt"</w:t>
               <w:br/>
               <w:br/>
-              <w:t># 计时从粘贴执行命令后开始，包含复制、标定和结果检查</w:t>
+              <w:t># 总计时包含复制 BAG、运行 Kalibr 和检查结果</w:t>
               <w:br/>
               <w:t>TOTAL_START_UTC="$(date -u +%Y-%m-%dT%H:%M:%SZ)"</w:t>
               <w:br/>
@@ -3082,7 +3254,7 @@
               <w:br/>
               <w:t>echo "SHA256：$COPY_SHA256"</w:t>
               <w:br/>
-              <w:t>echo "隔离输出目录：$RUN_DIR"</w:t>
+              <w:t>echo "结果保存目录：$RUN_DIR"</w:t>
               <w:br/>
               <w:t>echo "运行期间请勿关闭终端或按 Ctrl+C。"</w:t>
               <w:br/>

</xml_diff>

<commit_message>
Update headband calibration workflow to latest document
</commit_message>
<xml_diff>
--- a/docs/头环四鱼眼相机标定采集流程_内置SD卡版_日常快速启动版本终版.docx
+++ b/docs/头环四鱼眼相机标定采集流程_内置SD卡版_日常快速启动版本终版.docx
@@ -1111,7 +1111,7 @@
                     <w:rPr>
                       <w:rFonts w:eastAsia="Consolas" w:ascii="Consolas" w:cs="Consolas" w:hAnsi="Consolas"/>
                       <w:sz w:val="22"/>
-                      <w:shd w:fill="f76964"/>
+                      <w:shd w:fill="ffe928"/>
                     </w:rPr>
                     <w:t>192.168.10.109</w:t>
                   </w:r>
@@ -1266,7 +1266,7 @@
                     <w:rPr>
                       <w:rFonts w:eastAsia="Consolas" w:ascii="Consolas" w:cs="Consolas" w:hAnsi="Consolas"/>
                       <w:sz w:val="22"/>
-                      <w:shd w:fill="f76964"/>
+                      <w:shd w:fill="ffe928"/>
                     </w:rPr>
                     <w:t>192.168.10.11</w:t>
                   </w:r>
@@ -1437,7 +1437,7 @@
                     <w:rPr>
                       <w:rFonts w:eastAsia="Consolas" w:ascii="Consolas" w:cs="Consolas" w:hAnsi="Consolas"/>
                       <w:sz w:val="22"/>
-                      <w:shd w:fill="f76964"/>
+                      <w:shd w:fill="ffe928"/>
                     </w:rPr>
                     <w:t>192.168.10.109</w:t>
                   </w:r>
@@ -1744,7 +1744,28 @@
               </w:rPr>
               <w:t># 【每次要改】只修改这里：填入第 1 步 arp-scan 查到的当前头环 IP</w:t>
               <w:br/>
-              <w:t>HEADBAND_IP="192.168.10.109"</w:t>
+            </w:r>
+            <w:r>
+              <w:rPr>
+                <w:rFonts w:eastAsia="Consolas" w:ascii="Consolas" w:cs="Consolas" w:hAnsi="Consolas"/>
+                <w:sz w:val="22"/>
+              </w:rPr>
+              <w:t>HEADBAND_IP="</w:t>
+            </w:r>
+            <w:r>
+              <w:rPr>
+                <w:rFonts w:eastAsia="Consolas" w:ascii="Consolas" w:cs="Consolas" w:hAnsi="Consolas"/>
+                <w:sz w:val="22"/>
+                <w:shd w:fill="ffe928"/>
+              </w:rPr>
+              <w:t>192.168.10.109</w:t>
+            </w:r>
+            <w:r>
+              <w:rPr>
+                <w:rFonts w:eastAsia="Consolas" w:ascii="Consolas" w:cs="Consolas" w:hAnsi="Consolas"/>
+                <w:sz w:val="22"/>
+              </w:rPr>
+              <w:t>"</w:t>
               <w:br/>
               <w:br/>
               <w:t># 删除工作站中这个 IP 对应的旧 SSH 身份记录</w:t>
@@ -1986,7 +2007,7 @@
                     <w:rPr>
                       <w:rFonts w:eastAsia="Consolas" w:ascii="Consolas" w:cs="Consolas" w:hAnsi="Consolas"/>
                       <w:sz w:val="22"/>
-                      <w:shd w:fill="f76964"/>
+                      <w:shd w:fill="ffe928"/>
                     </w:rPr>
                     <w:t>192.168.10.109</w:t>
                   </w:r>
@@ -2011,13 +2032,6 @@
         <w:ind w:left="0" w:firstLine="0"/>
         <w:jc w:val="left"/>
       </w:pPr>
-    </w:p>
-    <w:p>
-      <w:pPr>
-        <w:spacing w:before="120" w:after="120" w:line="288" w:lineRule="auto"/>
-        <w:ind w:left="0" w:firstLine="0"/>
-        <w:jc w:val="left"/>
-      </w:pPr>
       <w:r>
         <w:rPr>
           <w:rFonts w:eastAsia="等线" w:ascii="Arial" w:cs="Arial" w:hAnsi="Arial"/>
@@ -2034,6 +2048,176 @@
         <w:t>浏览器打开 http://127.0.0.1:8766。采集结束后，在此预览终端按 Ctrl+C。预览只辅助观察，不代表 Kalibr 通过。</w:t>
       </w:r>
     </w:p>
+    <w:p>
+      <w:pPr>
+        <w:spacing w:before="120" w:after="120" w:line="288" w:lineRule="auto"/>
+        <w:ind w:left="0"/>
+        <w:jc w:val="left"/>
+      </w:pPr>
+      <w:r>
+        <w:rPr>
+          <w:rFonts w:eastAsia="等线" w:ascii="Arial" w:cs="Arial" w:hAnsi="Arial"/>
+          <w:sz w:val="22"/>
+          <w:shd w:fill="f76964"/>
+        </w:rPr>
+        <w:t>注意：如有端口报错先杀占用端口再运行四路预览</w:t>
+      </w:r>
+      <w:r>
+        <w:rPr>
+          <w:rFonts w:eastAsia="等线" w:ascii="Arial" w:cs="Arial" w:hAnsi="Arial"/>
+          <w:sz w:val="22"/>
+        </w:rPr>
+        <w:br/>
+      </w:r>
+    </w:p>
+    <w:tbl>
+      <w:tblPr>
+        <w:tblW w:w="0" w:type="auto"/>
+        <w:tblInd w:w="0" w:type="dxa"/>
+        <w:tblBorders>
+          <w:top w:val="single" w:color="dee0e3"/>
+          <w:left w:val="single" w:color="dee0e3"/>
+          <w:bottom w:val="single" w:color="dee0e3"/>
+          <w:right w:val="single" w:color="dee0e3"/>
+          <w:insideH w:val="single" w:color="dee0e3"/>
+          <w:insideV w:val="single" w:color="dee0e3"/>
+        </w:tblBorders>
+        <w:tblLayout w:type="fixed"/>
+      </w:tblPr>
+      <w:tblGrid>
+        <w:gridCol w:w="8280"/>
+      </w:tblGrid>
+      <w:tr>
+        <w:tc>
+          <w:tcPr>
+            <w:tcW w:w="8280" w:type="dxa"/>
+            <w:shd w:color="auto" w:val="clear" w:fill="f5f6f7"/>
+            <w:tcMar>
+              <w:top w:type="dxa" w:w="60"/>
+              <w:left w:type="dxa" w:w="120"/>
+              <w:bottom w:type="dxa" w:w="30"/>
+              <w:right w:type="dxa" w:w="120"/>
+            </w:tcMar>
+          </w:tcPr>
+          <w:p>
+            <w:pPr>
+              <w:spacing w:before="120" w:after="120" w:line="288" w:lineRule="auto"/>
+              <w:jc w:val="left"/>
+            </w:pPr>
+            <w:r>
+              <w:rPr>
+                <w:rFonts w:eastAsia="Consolas" w:ascii="Consolas" w:cs="Consolas" w:hAnsi="Consolas"/>
+                <w:color w:val="646a73"/>
+                <w:sz w:val="22"/>
+              </w:rPr>
+              <w:t>Bash</w:t>
+              <w:br w:type="textWrapping"/>
+            </w:r>
+            <w:r>
+              <w:rPr>
+                <w:rFonts w:eastAsia="Consolas" w:ascii="Consolas" w:cs="Consolas" w:hAnsi="Consolas"/>
+                <w:sz w:val="22"/>
+              </w:rPr>
+              <w:t>(</w:t>
+              <w:br/>
+              <w:t>set -euo pipefail</w:t>
+              <w:br/>
+              <w:br/>
+              <w:t>PORT=8766</w:t>
+              <w:br/>
+              <w:t>LISTENER="$(sudo ss -H -ltnp "( sport = :$PORT )")"</w:t>
+              <w:br/>
+              <w:br/>
+              <w:t>if [[ -z "$LISTENER" ]]; then</w:t>
+              <w:br/>
+              <w:t xml:space="preserve">  echo "端口 $PORT 空闲，可以启动预览。"</w:t>
+              <w:br/>
+              <w:t xml:space="preserve">  exit 0</w:t>
+              <w:br/>
+              <w:t>fi</w:t>
+              <w:br/>
+              <w:br/>
+              <w:t>mapfile -t PIDS &lt; &lt;(</w:t>
+              <w:br/>
+              <w:t xml:space="preserve">  printf '%s\n' "$LISTENER" |</w:t>
+              <w:br/>
+              <w:t xml:space="preserve">    grep -oE 'pid=[0-9]+' |</w:t>
+              <w:br/>
+              <w:t xml:space="preserve">    cut -d= -f2 |</w:t>
+              <w:br/>
+              <w:t xml:space="preserve">    sort -u</w:t>
+              <w:br/>
+              <w:t>)</w:t>
+              <w:br/>
+              <w:br/>
+              <w:t>if [[ "${#PIDS[@]}" -eq 0 ]]; then</w:t>
+              <w:br/>
+              <w:t xml:space="preserve">  echo "端口 $PORT 被占用，但无法确认进程；未停止任何程序。"</w:t>
+              <w:br/>
+              <w:t xml:space="preserve">  printf '%s\n' "$LISTENER"</w:t>
+              <w:br/>
+              <w:t xml:space="preserve">  exit 1</w:t>
+              <w:br/>
+              <w:t>fi</w:t>
+              <w:br/>
+              <w:br/>
+              <w:t># 先核对全部占用进程，避免停止其他程序</w:t>
+              <w:br/>
+              <w:t>for PID in "${PIDS[@]}"; do</w:t>
+              <w:br/>
+              <w:t xml:space="preserve">  CMD="$(sudo tr '\0' ' ' &lt; "/proc/$PID/cmdline")"</w:t>
+              <w:br/>
+              <w:t xml:space="preserve">  if [[ "$CMD" != *"/scripts/linux_viewer.py"* ||</w:t>
+              <w:br/>
+              <w:t xml:space="preserve">        "$CMD" != *"--port $PORT"* ]]; then</w:t>
+              <w:br/>
+              <w:t xml:space="preserve">    echo "端口 $PORT 由其他程序占用；未停止任何程序。"</w:t>
+              <w:br/>
+              <w:t xml:space="preserve">    printf 'PID %s：%s\n' "$PID" "$CMD"</w:t>
+              <w:br/>
+              <w:t xml:space="preserve">    exit 1</w:t>
+              <w:br/>
+              <w:t xml:space="preserve">  fi</w:t>
+              <w:br/>
+              <w:t>done</w:t>
+              <w:br/>
+              <w:br/>
+              <w:t>for PID in "${PIDS[@]}"; do</w:t>
+              <w:br/>
+              <w:t xml:space="preserve">  echo "停止旧四路预览：PID $PID"</w:t>
+              <w:br/>
+              <w:t xml:space="preserve">  sudo kill -TERM "$PID"</w:t>
+              <w:br/>
+              <w:t>done</w:t>
+              <w:br/>
+              <w:br/>
+              <w:t>sleep 2</w:t>
+              <w:br/>
+              <w:t>if sudo ss -H -ltnp "( sport = :$PORT )" | grep -q .; then</w:t>
+              <w:br/>
+              <w:t xml:space="preserve">  echo "端口 $PORT 仍被占用："</w:t>
+              <w:br/>
+              <w:t xml:space="preserve">  sudo ss -ltnp "( sport = :$PORT )"</w:t>
+              <w:br/>
+              <w:t xml:space="preserve">  exit 1</w:t>
+              <w:br/>
+              <w:t>fi</w:t>
+              <w:br/>
+              <w:br/>
+              <w:t>echo "端口 $PORT 已清理，可以启动四路预览。"</w:t>
+              <w:br/>
+            </w:r>
+            <w:r>
+              <w:rPr>
+                <w:rFonts w:eastAsia="Consolas" w:ascii="Consolas" w:cs="Consolas" w:hAnsi="Consolas"/>
+                <w:sz w:val="22"/>
+              </w:rPr>
+              <w:t>)</w:t>
+            </w:r>
+          </w:p>
+        </w:tc>
+      </w:tr>
+    </w:tbl>
     <w:p>
       <w:pPr>
         <w:pStyle w:val="1"/>
@@ -2157,7 +2341,7 @@
                     <w:rPr>
                       <w:rFonts w:eastAsia="Consolas" w:ascii="Consolas" w:cs="Consolas" w:hAnsi="Consolas"/>
                       <w:sz w:val="22"/>
-                      <w:shd w:fill="f76964"/>
+                      <w:shd w:fill="ffe928"/>
                     </w:rPr>
                     <w:t>192.168.10.109</w:t>
                   </w:r>
@@ -2280,9 +2464,9 @@
                     <w:rPr>
                       <w:rFonts w:eastAsia="Consolas" w:ascii="Consolas" w:cs="Consolas" w:hAnsi="Consolas"/>
                       <w:sz w:val="22"/>
-                      <w:shd w:fill="f76964"/>
-                    </w:rPr>
-                    <w:t>camera_cp0008_1013_1710.bag</w:t>
+                      <w:shd w:fill="ffe928"/>
+                    </w:rPr>
+                    <w:t>camera_cp0004_1015_1050.bag</w:t>
                   </w:r>
                   <w:r>
                     <w:rPr>
@@ -2633,69 +2817,69 @@
                     <w:rPr>
                       <w:rFonts w:eastAsia="Consolas" w:ascii="Consolas" w:cs="Consolas" w:hAnsi="Consolas"/>
                       <w:sz w:val="22"/>
+                      <w:shd w:fill="ffe928"/>
+                    </w:rPr>
+                    <w:t>camera_cp0004_1015_1050.bag</w:t>
+                  </w:r>
+                  <w:r>
+                    <w:rPr>
+                      <w:rFonts w:eastAsia="Consolas" w:ascii="Consolas" w:cs="Consolas" w:hAnsi="Consolas"/>
+                      <w:sz w:val="22"/>
+                    </w:rPr>
+                    <w:t>"</w:t>
+                    <w:br/>
+                  </w:r>
+                  <w:r>
+                    <w:rPr>
+                      <w:rFonts w:eastAsia="Consolas" w:ascii="Consolas" w:cs="Consolas" w:hAnsi="Consolas"/>
+                      <w:sz w:val="22"/>
+                    </w:rPr>
+                    <w:t>mkdir -p /home/key/文档/kalibr/data/</w:t>
+                  </w:r>
+                  <w:r>
+                    <w:rPr>
+                      <w:rFonts w:eastAsia="Consolas" w:ascii="Consolas" w:cs="Consolas" w:hAnsi="Consolas"/>
+                      <w:sz w:val="22"/>
+                      <w:shd w:fill="ffe928"/>
+                    </w:rPr>
+                    <w:t>cp-0004</w:t>
+                  </w:r>
+                  <w:r>
+                    <w:rPr>
+                      <w:rFonts w:eastAsia="Consolas" w:ascii="Consolas" w:cs="Consolas" w:hAnsi="Consolas"/>
+                      <w:sz w:val="22"/>
+                    </w:rPr>
+                    <w:br/>
+                  </w:r>
+                  <w:r>
+                    <w:rPr>
+                      <w:rFonts w:eastAsia="Consolas" w:ascii="Consolas" w:cs="Consolas" w:hAnsi="Consolas"/>
+                      <w:sz w:val="22"/>
+                    </w:rPr>
+                    <w:t>rsync -avP --partial orangepi@</w:t>
+                  </w:r>
+                  <w:r>
+                    <w:rPr>
+                      <w:rFonts w:eastAsia="Consolas" w:ascii="Consolas" w:cs="Consolas" w:hAnsi="Consolas"/>
+                      <w:sz w:val="22"/>
+                      <w:shd w:fill="ffe928"/>
+                    </w:rPr>
+                    <w:t>192.168.10.109</w:t>
+                  </w:r>
+                  <w:r>
+                    <w:rPr>
+                      <w:rFonts w:eastAsia="Consolas" w:ascii="Consolas" w:cs="Consolas" w:hAnsi="Consolas"/>
+                      <w:sz w:val="22"/>
+                    </w:rPr>
+                    <w:t xml:space="preserve">:/media/orangepi/sdcard/data/kalibr_bags/"$BAG_NAME" </w:t>
+                  </w:r>
+                  <w:r>
+                    <w:rPr>
+                      <w:rFonts w:eastAsia="Consolas" w:ascii="Consolas" w:cs="Consolas" w:hAnsi="Consolas"/>
+                      <w:sz w:val="22"/>
                       <w:shd w:fill="f76964"/>
                     </w:rPr>
-                    <w:t>camera_cp0008_1013_1710.bag</w:t>
-                  </w:r>
-                  <w:r>
-                    <w:rPr>
-                      <w:rFonts w:eastAsia="Consolas" w:ascii="Consolas" w:cs="Consolas" w:hAnsi="Consolas"/>
-                      <w:sz w:val="22"/>
-                    </w:rPr>
-                    <w:t>"</w:t>
-                    <w:br/>
-                  </w:r>
-                  <w:r>
-                    <w:rPr>
-                      <w:rFonts w:eastAsia="Consolas" w:ascii="Consolas" w:cs="Consolas" w:hAnsi="Consolas"/>
-                      <w:sz w:val="22"/>
-                    </w:rPr>
-                    <w:t>mkdir -p /home/key/文档/kalibr/data/</w:t>
-                  </w:r>
-                  <w:r>
-                    <w:rPr>
-                      <w:rFonts w:eastAsia="Consolas" w:ascii="Consolas" w:cs="Consolas" w:hAnsi="Consolas"/>
-                      <w:sz w:val="22"/>
-                      <w:shd w:fill="f76964"/>
-                    </w:rPr>
-                    <w:t>cp-0008</w:t>
-                  </w:r>
-                  <w:r>
-                    <w:rPr>
-                      <w:rFonts w:eastAsia="Consolas" w:ascii="Consolas" w:cs="Consolas" w:hAnsi="Consolas"/>
-                      <w:sz w:val="22"/>
-                    </w:rPr>
-                    <w:br/>
-                  </w:r>
-                  <w:r>
-                    <w:rPr>
-                      <w:rFonts w:eastAsia="Consolas" w:ascii="Consolas" w:cs="Consolas" w:hAnsi="Consolas"/>
-                      <w:sz w:val="22"/>
-                    </w:rPr>
-                    <w:t>rsync -avP --partial orangepi@</w:t>
-                  </w:r>
-                  <w:r>
-                    <w:rPr>
-                      <w:rFonts w:eastAsia="Consolas" w:ascii="Consolas" w:cs="Consolas" w:hAnsi="Consolas"/>
-                      <w:sz w:val="22"/>
-                      <w:shd w:fill="f76964"/>
-                    </w:rPr>
-                    <w:t>192.168.10.109</w:t>
-                  </w:r>
-                  <w:r>
-                    <w:rPr>
-                      <w:rFonts w:eastAsia="Consolas" w:ascii="Consolas" w:cs="Consolas" w:hAnsi="Consolas"/>
-                      <w:sz w:val="22"/>
-                    </w:rPr>
-                    <w:t xml:space="preserve">:/media/orangepi/sdcard/data/kalibr_bags/"$BAG_NAME" </w:t>
-                  </w:r>
-                  <w:r>
-                    <w:rPr>
-                      <w:rFonts w:eastAsia="Consolas" w:ascii="Consolas" w:cs="Consolas" w:hAnsi="Consolas"/>
-                      <w:sz w:val="22"/>
-                      <w:shd w:fill="f76964"/>
-                    </w:rPr>
-                    <w:t>/home/key/文档/kalibr/data/cp=0008/</w:t>
+                    <w:t>/home/key/文档/kalibr/data/cp-0004/</w:t>
                   </w:r>
                 </w:p>
               </w:tc>
@@ -2835,9 +3019,9 @@
                     <w:rPr>
                       <w:rFonts w:eastAsia="Consolas" w:ascii="Consolas" w:cs="Consolas" w:hAnsi="Consolas"/>
                       <w:sz w:val="22"/>
-                      <w:shd w:fill="f76964"/>
-                    </w:rPr>
-                    <w:t>camera_cp0008_1013_1710.bag</w:t>
+                      <w:shd w:fill="ffe928"/>
+                    </w:rPr>
+                    <w:t>camera_cp0004_1015_1050.bag</w:t>
                   </w:r>
                   <w:r>
                     <w:rPr>
@@ -2858,7 +3042,7 @@
                     <w:rPr>
                       <w:rFonts w:eastAsia="Consolas" w:ascii="Consolas" w:cs="Consolas" w:hAnsi="Consolas"/>
                       <w:sz w:val="22"/>
-                      <w:shd w:fill="f76964"/>
+                      <w:shd w:fill="ffe928"/>
                     </w:rPr>
                     <w:t>192.168.10.109</w:t>
                   </w:r>
@@ -2881,9 +3065,9 @@
                     <w:rPr>
                       <w:rFonts w:eastAsia="Consolas" w:ascii="Consolas" w:cs="Consolas" w:hAnsi="Consolas"/>
                       <w:sz w:val="22"/>
-                      <w:shd w:fill="f76964"/>
-                    </w:rPr>
-                    <w:t>/home/key/文档/kalibr/data/cp-0008</w:t>
+                      <w:shd w:fill="ffe928"/>
+                    </w:rPr>
+                    <w:t>/home/key/文档/kalibr/data/cp-0004</w:t>
                   </w:r>
                   <w:r>
                     <w:rPr>
@@ -2898,15 +3082,15 @@
                       <w:rFonts w:eastAsia="Consolas" w:ascii="Consolas" w:cs="Consolas" w:hAnsi="Consolas"/>
                       <w:sz w:val="22"/>
                     </w:rPr>
-                    <w:t>docker exec kalibr bash -lc "source /opt/ros/noetic/setup.bash &amp;&amp; rosbag info /</w:t>
-                  </w:r>
-                  <w:r>
-                    <w:rPr>
-                      <w:rFonts w:eastAsia="Consolas" w:ascii="Consolas" w:cs="Consolas" w:hAnsi="Consolas"/>
-                      <w:sz w:val="22"/>
-                      <w:shd w:fill="f76964"/>
-                    </w:rPr>
-                    <w:t>data/cp-0008</w:t>
+                    <w:t>docker exec kalibr bash -lc "source /opt/ros/noetic/setup.bash &amp;&amp; rosbag info /data/</w:t>
+                  </w:r>
+                  <w:r>
+                    <w:rPr>
+                      <w:rFonts w:eastAsia="Consolas" w:ascii="Consolas" w:cs="Consolas" w:hAnsi="Consolas"/>
+                      <w:sz w:val="22"/>
+                      <w:shd w:fill="ffe928"/>
+                    </w:rPr>
+                    <w:t>cp-0004</w:t>
                   </w:r>
                   <w:r>
                     <w:rPr>
@@ -3082,9 +3266,9 @@
               <w:rPr>
                 <w:rFonts w:eastAsia="Consolas" w:ascii="Consolas" w:cs="Consolas" w:hAnsi="Consolas"/>
                 <w:sz w:val="22"/>
-                <w:shd w:fill="f76964"/>
+                <w:shd w:fill="ffe928"/>
               </w:rPr>
-              <w:t>cp-0008</w:t>
+              <w:t>cp-0004</w:t>
             </w:r>
             <w:r>
               <w:rPr>
@@ -3093,28 +3277,7 @@
               </w:rPr>
               <w:t>"  # 本次设备编号</w:t>
               <w:br/>
-            </w:r>
-            <w:r>
-              <w:rPr>
-                <w:rFonts w:eastAsia="Consolas" w:ascii="Consolas" w:cs="Consolas" w:hAnsi="Consolas"/>
-                <w:sz w:val="22"/>
-              </w:rPr>
-              <w:t>SOURCE_BAG="</w:t>
-            </w:r>
-            <w:r>
-              <w:rPr>
-                <w:rFonts w:eastAsia="Consolas" w:ascii="Consolas" w:cs="Consolas" w:hAnsi="Consolas"/>
-                <w:sz w:val="22"/>
-                <w:shd w:fill="f76964"/>
-              </w:rPr>
-              <w:t>/home/key/文档/kalibr/data/cp-0008/camera_cp0008_1013_1710.bag</w:t>
-            </w:r>
-            <w:r>
-              <w:rPr>
-                <w:rFonts w:eastAsia="Consolas" w:ascii="Consolas" w:cs="Consolas" w:hAnsi="Consolas"/>
-                <w:sz w:val="22"/>
-              </w:rPr>
-              <w:t>"  # 原始 BAG 的绝对路径</w:t>
+              <w:t>SOURCE_BAG="/home/key/文档/kalibr/data/cp-0004/camera_cp0004_1015_1050.bag"  # 原始 BAG 的绝对路径</w:t>
               <w:br/>
               <w:t>BAG_FREQ_HZ="10.0"  # 抽帧频率，例如 10.0、5.0、2.0</w:t>
               <w:br/>
@@ -3130,9 +3293,9 @@
               <w:rPr>
                 <w:rFonts w:eastAsia="Consolas" w:ascii="Consolas" w:cs="Consolas" w:hAnsi="Consolas"/>
                 <w:sz w:val="22"/>
-                <w:shd w:fill="f76964"/>
+                <w:shd w:fill="ffe928"/>
               </w:rPr>
-              <w:t>/home/key/文档/kalibr/data/cp-0008</w:t>
+              <w:t>/home/key/文档/kalibr/data/cp-0004</w:t>
             </w:r>
             <w:r>
               <w:rPr>
@@ -3562,15 +3725,15 @@
                       <w:rFonts w:eastAsia="Consolas" w:ascii="Consolas" w:cs="Consolas" w:hAnsi="Consolas"/>
                       <w:sz w:val="22"/>
                     </w:rPr>
-                    <w:t>BAG_NAME="</w:t>
-                  </w:r>
-                  <w:r>
-                    <w:rPr>
-                      <w:rFonts w:eastAsia="Consolas" w:ascii="Consolas" w:cs="Consolas" w:hAnsi="Consolas"/>
-                      <w:sz w:val="22"/>
-                      <w:shd w:fill="f76964"/>
-                    </w:rPr>
-                    <w:t>camera_cp00016_0922_1545.bag</w:t>
+                    <w:t>BAG_NAME=</w:t>
+                  </w:r>
+                  <w:r>
+                    <w:rPr>
+                      <w:rFonts w:eastAsia="Consolas" w:ascii="Consolas" w:cs="Consolas" w:hAnsi="Consolas"/>
+                      <w:sz w:val="22"/>
+                      <w:shd w:fill="ffe928"/>
+                    </w:rPr>
+                    <w:t>"camera_cp0003_1014_1530.bag</w:t>
                   </w:r>
                   <w:r>
                     <w:rPr>
@@ -3975,61 +4138,9 @@
           <w:b w:val="true"/>
           <w:sz w:val="36"/>
         </w:rPr>
-        <w:t>三 附：</w:t>
-      </w:r>
-      <w:hyperlink r:id="rId4">
-        <w:r>
-          <w:rPr>
-            <w:rFonts w:eastAsia="等线" w:ascii="Arial" w:cs="Arial" w:hAnsi="Arial"/>
-            <w:b w:val="true"/>
-            <w:color w:val="3370ff"/>
-            <w:sz w:val="36"/>
-          </w:rPr>
-          <w:t>头环三项标定流程</w:t>
-        </w:r>
-      </w:hyperlink>
+        <w:t>三 ：imu标定验证命令</w:t>
+      </w:r>
       <w:bookmarkEnd w:id="17"/>
-    </w:p>
-    <w:p>
-      <w:pPr>
-        <w:spacing w:before="120" w:after="120" w:line="288" w:lineRule="auto"/>
-        <w:ind w:left="0"/>
-        <w:jc w:val="left"/>
-      </w:pPr>
-    </w:p>
-    <w:p>
-      <w:pPr>
-        <w:spacing w:before="120" w:after="120" w:line="288" w:lineRule="auto"/>
-        <w:ind w:left="0"/>
-        <w:jc w:val="left"/>
-      </w:pPr>
-    </w:p>
-    <w:p>
-      <w:pPr>
-        <w:spacing w:before="120" w:after="120" w:line="288" w:lineRule="auto"/>
-        <w:ind w:left="0"/>
-        <w:jc w:val="left"/>
-      </w:pPr>
-    </w:p>
-    <w:p>
-      <w:pPr>
-        <w:pStyle w:val="1"/>
-        <w:spacing w:before="380" w:after="140" w:line="288" w:lineRule="auto"/>
-        <w:ind w:left="0"/>
-        <w:jc w:val="left"/>
-        <w:outlineLvl w:val="0"/>
-      </w:pPr>
-      <w:bookmarkStart w:name="heading_18" w:id="18"/>
-      <w:r>
-        <w:rPr>
-          <w:rFonts w:eastAsia="等线" w:ascii="Arial" w:cs="Arial" w:hAnsi="Arial"/>
-          <w:b w:val="true"/>
-          <w:sz w:val="36"/>
-        </w:rPr>
-        <w:t>四 附：camera_imu   DS验证命令</w:t>
-        <w:br/>
-      </w:r>
-      <w:bookmarkEnd w:id="18"/>
     </w:p>
     <w:tbl>
       <w:tblPr>
@@ -4083,405 +4194,720 @@
               <w:br/>
               <w:t>set -Eeuo pipefail</w:t>
               <w:br/>
-              <w:t>trap 'rc=$?; trap - EXIT; printf "\n脚本结束，退出码：%s\n" "$rc"; read -r -p "按回车关闭窗口..." _ || true; exit "$rc"' EXIT</w:t>
-              <w:br/>
-              <w:br/>
-              <w:t># ===== 每次使用时只修改以下 2 行 =====</w:t>
-              <w:br/>
-              <w:t>DEVICE_DIR="cs-0001"                                   # 设备目录，例如 cs-0001、cp-00016</w:t>
-              <w:br/>
-              <w:t>CAMERA_BAG_BASE="camera_cs0001_1010_1600"              # 第一步 BAG 名，不带 .bag；用于找到对应 camchain</w:t>
-              <w:br/>
-              <w:t># ======================================</w:t>
-              <w:br/>
+              <w:br/>
+              <w:t># ================= 每次使用时检查、修改以下 4 行 =================</w:t>
+              <w:br/>
+              <w:br/>
+              <w:t># ① 静止 IMU BAG 的完整路径，支持 .bag 和 .bag.active</w:t>
+              <w:br/>
+              <w:t># 执行前必须确认录制已停止，采集过程中头环保持静止</w:t>
+              <w:br/>
+              <w:t>SOURCE_BAG="/home/key/文档/kalibr/data/cp-0003/imu/imu_cp0003_1014_1115.bag.active"</w:t>
+              <w:br/>
+              <w:br/>
+              <w:t># ② 结果保存的父目录</w:t>
+              <w:br/>
+              <w:t># 自动创建 allan_runs/UTC时间戳/，不覆盖已有结果</w:t>
+              <w:br/>
+              <w:t>OUTPUT_ROOT="/home/key/文档/kalibr/data/cp-0003/imu"</w:t>
+              <w:br/>
+              <w:br/>
+              <w:t># ③ BAG 中实际录制的 IMU Topic</w:t>
+              <w:br/>
+              <w:t># 当前头环通常为 /imu_data_raw</w:t>
+              <w:br/>
+              <w:t>IMU_TOPIC="/imu_data_raw"</w:t>
+              <w:br/>
+              <w:br/>
+              <w:t># ④ 分析采用的 IMU 名义采样频率，单位 Hz</w:t>
+              <w:br/>
+              <w:t># 应根据设备采样设置或原 baai_ego.yaml 填写</w:t>
+              <w:br/>
+              <w:t># 200 是沿用的名义值，不是从你提供的方法中确认出的值</w:t>
+              <w:br/>
+              <w:t># 本次 BAG 时间戳测得约 202.31 Hz，脚本会记录频率差异</w:t>
+              <w:br/>
+              <w:t>IMU_RATE_HZ="200"</w:t>
+              <w:br/>
+              <w:br/>
+              <w:t># ===============================================================</w:t>
+              <w:br/>
+              <w:br/>
+              <w:t># 当前工作站固定设置，日常更换设备或 BAG 时不用修改</w:t>
+              <w:br/>
+              <w:t>CONTAINER="imu_allan_20261014"</w:t>
               <w:br/>
               <w:t>DATA_ROOT="/home/key/文档/kalibr/data"</w:t>
               <w:br/>
-              <w:t>CAMERA_IMU_DIR="$DATA_ROOT/$DEVICE_DIR/camera_imu"</w:t>
-              <w:br/>
-              <w:br/>
-              <w:t># 第一步相机标定结果、第二步 IMU 配置、标定板</w:t>
-              <w:br/>
-              <w:t>CAMCHAIN="$DATA_ROOT/$DEVICE_DIR/camera/${CAMERA_BAG_BASE}-camchain.yaml"</w:t>
-              <w:br/>
-              <w:t>IMU_YAML="$DATA_ROOT/$DEVICE_DIR/imu/imu.yaml"</w:t>
-              <w:br/>
-              <w:t>TARGET="$DATA_ROOT/april_6x6.yaml"</w:t>
-              <w:br/>
-              <w:br/>
-              <w:t># 自动识别第三步动态 BAG；必须恰好有一个 camera_imu*.bag</w:t>
-              <w:br/>
-              <w:t>mapfile -t CAMERA_IMU_BAGS &lt; &lt;(</w:t>
-              <w:br/>
-              <w:t xml:space="preserve">  find "$CAMERA_IMU_DIR" -maxdepth 1 -type f \</w:t>
-              <w:br/>
-              <w:t xml:space="preserve">    -name 'camera_imu*.bag' ! -name '*.orig.bag' -print | sort</w:t>
-              <w:br/>
-              <w:t>)</w:t>
-              <w:br/>
-              <w:br/>
-              <w:t>if [[ "${#CAMERA_IMU_BAGS[@]}" -eq 0 ]]; then</w:t>
-              <w:br/>
-              <w:t xml:space="preserve">  echo "没有找到第三步 Camera-IMU BAG，当前不能运行联合标定。" &gt;&amp;2</w:t>
-              <w:br/>
-              <w:t xml:space="preserve">  echo "请先录制 BAG 并放入：$CAMERA_IMU_DIR" &gt;&amp;2</w:t>
+              <w:br/>
+              <w:t>RUN_DIR=""</w:t>
+              <w:br/>
+              <w:t>TOTAL_START="$(date +%s)"</w:t>
+              <w:br/>
+              <w:br/>
+              <w:t># 成功或失败都显示退出码，并保留终端窗口</w:t>
+              <w:br/>
+              <w:t>finish() {</w:t>
+              <w:br/>
+              <w:t xml:space="preserve">  RC=$?</w:t>
+              <w:br/>
+              <w:t xml:space="preserve">  trap - EXIT</w:t>
+              <w:br/>
+              <w:t xml:space="preserve">  set +e</w:t>
+              <w:br/>
+              <w:t xml:space="preserve">  if [[ -n "$RUN_DIR" &amp;&amp; -d "$RUN_DIR" ]]; then</w:t>
+              <w:br/>
+              <w:t xml:space="preserve">    printf 'script_exit_code=%s\ntotal_wall_seconds=%s\n' \</w:t>
+              <w:br/>
+              <w:t xml:space="preserve">      "$RC" "$(( $(date +%s) - TOTAL_START ))" \</w:t>
+              <w:br/>
+              <w:t xml:space="preserve">      &gt; "$RUN_DIR/completion.txt"</w:t>
+              <w:br/>
+              <w:t xml:space="preserve">  fi</w:t>
+              <w:br/>
+              <w:t xml:space="preserve">  printf '\n脚本结束，退出码：%s\n结果目录：%s\n' "$RC" "$RUN_DIR"</w:t>
+              <w:br/>
+              <w:t xml:space="preserve">  read -r -p "按回车关闭窗口..." _ || true</w:t>
+              <w:br/>
+              <w:t xml:space="preserve">  exit "$RC"</w:t>
+              <w:br/>
+              <w:t>}</w:t>
+              <w:br/>
+              <w:t>trap finish EXIT</w:t>
+              <w:br/>
+              <w:br/>
+              <w:t># 检查原文件和分析容器</w:t>
+              <w:br/>
+              <w:t>[[ -s "$SOURCE_BAG" ]] || {</w:t>
+              <w:br/>
+              <w:t xml:space="preserve">  echo "原始 BAG 不存在或为空：$SOURCE_BAG"</w:t>
               <w:br/>
               <w:t xml:space="preserve">  exit 1</w:t>
               <w:br/>
-              <w:t>elif [[ "${#CAMERA_IMU_BAGS[@]}" -gt 1 ]]; then</w:t>
-              <w:br/>
-              <w:t xml:space="preserve">  echo "找到多个 Camera-IMU BAG，请先确认本次要使用的文件：" &gt;&amp;2</w:t>
-              <w:br/>
-              <w:t xml:space="preserve">  printf '  %s\n' "${CAMERA_IMU_BAGS[@]}" &gt;&amp;2</w:t>
-              <w:br/>
-              <w:t xml:space="preserve">  exit 2</w:t>
+              <w:t>}</w:t>
+              <w:br/>
+              <w:br/>
+              <w:t>[[ "$(docker inspect -f '{{.State.Running}}' "$CONTAINER" 2&gt;/dev/null)" == true ]] || {</w:t>
+              <w:br/>
+              <w:t xml:space="preserve">  echo "分析容器未运行：$CONTAINER"</w:t>
+              <w:br/>
+              <w:t xml:space="preserve">  echo "请先执行：docker start $CONTAINER"</w:t>
+              <w:br/>
+              <w:t xml:space="preserve">  exit 1</w:t>
+              <w:br/>
+              <w:t>}</w:t>
+              <w:br/>
+              <w:br/>
+              <w:t># 检查结果目录和容器挂载</w:t>
+              <w:br/>
+              <w:t>DATA_ROOT="$(realpath -e "$DATA_ROOT")"</w:t>
+              <w:br/>
+              <w:t>OUTPUT_ROOT="$(realpath -m "$OUTPUT_ROOT")"</w:t>
+              <w:br/>
+              <w:br/>
+              <w:t>if [[ "$OUTPUT_ROOT" != "$DATA_ROOT" &amp;&amp;</w:t>
+              <w:br/>
+              <w:t xml:space="preserve">      "$OUTPUT_ROOT" != "$DATA_ROOT/"* ]]; then</w:t>
+              <w:br/>
+              <w:t xml:space="preserve">  echo "结果父目录必须位于：$DATA_ROOT"</w:t>
+              <w:br/>
+              <w:t xml:space="preserve">  exit 1</w:t>
               <w:br/>
               <w:t>fi</w:t>
               <w:br/>
               <w:br/>
-              <w:t>SOURCE_BAG="${CAMERA_IMU_BAGS[0]}"</w:t>
+              <w:t>MOUNT_SOURCE="$(docker inspect -f \</w:t>
+              <w:br/>
+              <w:t xml:space="preserve">  '{{range .Mounts}}{{if eq .Destination "/data"}}{{.Source}}{{end}}{{end}}' \</w:t>
+              <w:br/>
+              <w:t xml:space="preserve">  "$CONTAINER")"</w:t>
+              <w:br/>
+              <w:br/>
+              <w:t>if [[ -z "$MOUNT_SOURCE" ||</w:t>
+              <w:br/>
+              <w:t xml:space="preserve">      "$(realpath -e "$MOUNT_SOURCE")" != "$DATA_ROOT" ]]; then</w:t>
+              <w:br/>
+              <w:t xml:space="preserve">  echo "容器 /data 挂载与工作站 DATA_ROOT 不一致，停止。"</w:t>
+              <w:br/>
+              <w:t xml:space="preserve">  exit 1</w:t>
+              <w:br/>
+              <w:t>fi</w:t>
+              <w:br/>
+              <w:br/>
+              <w:t># 原 .bag.active 保留；仅将副本命名为 .bag</w:t>
               <w:br/>
               <w:t>BAG_NAME="$(basename "$SOURCE_BAG")"</w:t>
               <w:br/>
-              <w:t>BAG_BASE="${BAG_NAME%.bag}"</w:t>
-              <w:br/>
-              <w:br/>
-              <w:t># 所有输出进入独立测试目录，不覆盖第一步、第二步或已有第三步结果</w:t>
-              <w:br/>
-              <w:t>RUN_TAG="ds_camera_imu_5hz_$(date -u +%Y%m%dT%H%M%SZ)"</w:t>
-              <w:br/>
-              <w:t>RUN_DIR="$CAMERA_IMU_DIR/ds_joint_tests/$RUN_TAG"</w:t>
-              <w:br/>
-              <w:t>RUN_DIR_INNER="/data/$DEVICE_DIR/camera_imu/ds_joint_tests/$RUN_TAG"</w:t>
-              <w:br/>
-              <w:br/>
-              <w:t>CAMCHAIN_INNER="/data/$DEVICE_DIR/camera/${CAMERA_BAG_BASE}-camchain.yaml"</w:t>
-              <w:br/>
-              <w:t>IMU_INNER="/data/$DEVICE_DIR/imu/imu.yaml"</w:t>
-              <w:br/>
-              <w:t>TARGET_INNER="/data/april_6x6.yaml"</w:t>
-              <w:br/>
-              <w:t>BAG_INNER="$RUN_DIR_INNER/$BAG_NAME"</w:t>
-              <w:br/>
-              <w:br/>
-              <w:t>CAMCHAIN_OUT="$RUN_DIR/${BAG_BASE}-camchain-imucam.yaml"</w:t>
-              <w:br/>
-              <w:t>IMU_OUT="$RUN_DIR/${BAG_BASE}-imu.yaml"</w:t>
-              <w:br/>
-              <w:t>RESULTS_OUT="$RUN_DIR/${BAG_BASE}-results-imucam.txt"</w:t>
-              <w:br/>
-              <w:t>REPORT_OUT="$RUN_DIR/${BAG_BASE}-report-imucam.pdf"</w:t>
-              <w:br/>
-              <w:t>LOG_FILE="$RUN_DIR/run.log"</w:t>
-              <w:br/>
-              <w:t>BAG_INFO="$RUN_DIR/bag_info.txt"</w:t>
-              <w:br/>
-              <w:t>METADATA="$RUN_DIR/run_metadata.txt"</w:t>
-              <w:br/>
-              <w:br/>
-              <w:t>TOTAL_START_UTC="$(date -u +%Y-%m-%dT%H:%M:%SZ)"</w:t>
-              <w:br/>
-              <w:t>TOTAL_START_SECONDS="$(date +%s)"</w:t>
-              <w:br/>
-              <w:br/>
-              <w:t>for FILE in "$CAMCHAIN" "$IMU_YAML" "$TARGET" "$SOURCE_BAG"; do</w:t>
-              <w:br/>
-              <w:t xml:space="preserve">  if [[ ! -s "$FILE" ]]; then</w:t>
-              <w:br/>
-              <w:t xml:space="preserve">    echo "文件不存在或为空，停止：$FILE" &gt;&amp;2</w:t>
+              <w:t>BAG_NAME="${BAG_NAME%.active}"</w:t>
+              <w:br/>
+              <w:t>[[ "$BAG_NAME" == *.bag ]] || {</w:t>
+              <w:br/>
+              <w:t xml:space="preserve">  echo "输入文件名必须以 .bag 或 .bag.active 结尾。"</w:t>
+              <w:br/>
+              <w:t xml:space="preserve">  exit 1</w:t>
+              <w:br/>
+              <w:t>}</w:t>
+              <w:br/>
+              <w:br/>
+              <w:t># 创建本次独立目录，已有同名目录时停止</w:t>
+              <w:br/>
+              <w:t>mkdir -p "$OUTPUT_ROOT/allan_runs"</w:t>
+              <w:br/>
+              <w:t>RUN_DIR="$OUTPUT_ROOT/allan_runs/$(date -u +%Y%m%dT%H%M%SZ)"</w:t>
+              <w:br/>
+              <w:t>mkdir "$RUN_DIR"</w:t>
+              <w:br/>
+              <w:t>mkdir "$RUN_DIR/raw" "$RUN_DIR/cooked"</w:t>
+              <w:br/>
+              <w:t>RUN_INNER="/data${RUN_DIR#"$DATA_ROOT"}"</w:t>
+              <w:br/>
+              <w:br/>
+              <w:t>echo "原始 BAG：$SOURCE_BAG"</w:t>
+              <w:br/>
+              <w:t>echo "本次结果目录：$RUN_DIR"</w:t>
+              <w:br/>
+              <w:br/>
+              <w:t># 复制并核对 SHA256</w:t>
+              <w:br/>
+              <w:t>cp -v -- "$SOURCE_BAG" "$RUN_DIR/raw/$BAG_NAME"</w:t>
+              <w:br/>
+              <w:t>SOURCE_SHA="$(sha256sum "$SOURCE_BAG" | awk '{print $1}')"</w:t>
+              <w:br/>
+              <w:t>COPY_SHA="$(sha256sum "$RUN_DIR/raw/$BAG_NAME" | awk '{print $1}')"</w:t>
+              <w:br/>
+              <w:br/>
+              <w:t>[[ "$SOURCE_SHA" == "$COPY_SHA" ]] || {</w:t>
+              <w:br/>
+              <w:t xml:space="preserve">  echo "副本 SHA256 不一致，停止。"</w:t>
+              <w:br/>
+              <w:t xml:space="preserve">  exit 1</w:t>
+              <w:br/>
+              <w:t>}</w:t>
+              <w:br/>
+              <w:br/>
+              <w:t>{</w:t>
+              <w:br/>
+              <w:t xml:space="preserve">  printf 'source_bag=%s\n' "$SOURCE_BAG"</w:t>
+              <w:br/>
+              <w:t xml:space="preserve">  printf 'source_sha256=%s\n' "$SOURCE_SHA"</w:t>
+              <w:br/>
+              <w:t xml:space="preserve">  printf 'copy_sha256_before_reindex=%s\n' "$COPY_SHA"</w:t>
+              <w:br/>
+              <w:t xml:space="preserve">  printf 'imu_topic=%s\n' "$IMU_TOPIC"</w:t>
+              <w:br/>
+              <w:t xml:space="preserve">  printf 'nominal_imu_rate_hz=%s\n' "$IMU_RATE_HZ"</w:t>
+              <w:br/>
+              <w:t xml:space="preserve">  printf 'output_directory=%s\n' "$RUN_DIR"</w:t>
+              <w:br/>
+              <w:t xml:space="preserve">  printf 'container_id=%s\n' "$(docker inspect -f '{{.Id}}' "$CONTAINER")"</w:t>
+              <w:br/>
+              <w:t xml:space="preserve">  printf 'start_utc=%s\n' "$(date -u +%Y-%m-%dT%H:%M:%SZ)"</w:t>
+              <w:br/>
+              <w:t>} &gt; "$RUN_DIR/run_metadata.txt"</w:t>
+              <w:br/>
+              <w:br/>
+              <w:t>set +e</w:t>
+              <w:br/>
+              <w:t>docker exec -i \</w:t>
+              <w:br/>
+              <w:t xml:space="preserve">  -e RUN_INNER="$RUN_INNER" \</w:t>
+              <w:br/>
+              <w:t xml:space="preserve">  -e BAG_NAME="$BAG_NAME" \</w:t>
+              <w:br/>
+              <w:t xml:space="preserve">  -e IMU_TOPIC="$IMU_TOPIC" \</w:t>
+              <w:br/>
+              <w:t xml:space="preserve">  -e IMU_RATE_HZ="$IMU_RATE_HZ" \</w:t>
+              <w:br/>
+              <w:t xml:space="preserve">  "$CONTAINER" bash -s &lt;&lt;'CONTAINER_SCRIPT' 2&gt;&amp;1 | tee "$RUN_DIR/run.log"</w:t>
+              <w:br/>
+              <w:t>set -eo pipefail</w:t>
+              <w:br/>
+              <w:t>source /opt/ros/noetic/setup.bash</w:t>
+              <w:br/>
+              <w:t>source /allan_ws/devel/setup.bash</w:t>
+              <w:br/>
+              <w:t>export MPLBACKEND=Agg</w:t>
+              <w:br/>
+              <w:t>export OMP_NUM_THREADS=4</w:t>
+              <w:br/>
+              <w:t>unset DISPLAY</w:t>
+              <w:br/>
+              <w:br/>
+              <w:t>RUN="$RUN_INNER"</w:t>
+              <w:br/>
+              <w:t>RAW="$RUN/raw/$BAG_NAME"</w:t>
+              <w:br/>
+              <w:t>COOKED="$RUN/cooked/cooked_$BAG_NAME"</w:t>
+              <w:br/>
+              <w:t>export RAW</w:t>
+              <w:br/>
+              <w:t>cd "$RUN"</w:t>
+              <w:br/>
+              <w:br/>
+              <w:t>PKG="$(rospack find allan_variance_ros)"</w:t>
+              <w:br/>
+              <w:t>if [[ -d "$PKG/.git" ]]; then</w:t>
+              <w:br/>
+              <w:t xml:space="preserve">  git -C "$PKG" rev-parse HEAD &gt; "$RUN/allan_source_commit.txt"</w:t>
+              <w:br/>
+              <w:t>fi</w:t>
+              <w:br/>
+              <w:br/>
+              <w:t># 容器内实际处理进程的 real/user/sys 会写入 run.log</w:t>
+              <w:br/>
+              <w:t>TIMEFORMAT=$'real %3R\nuser %3U\nsys %3S'</w:t>
+              <w:br/>
+              <w:br/>
+              <w:t>echo "=== 1 检查索引，缺失时自动恢复副本 ==="</w:t>
+              <w:br/>
+              <w:br/>
+              <w:t>if rosbag info "$RAW" &gt; "$RUN/bag_info.txt" 2&gt;&amp;1; then</w:t>
+              <w:br/>
+              <w:t xml:space="preserve">  echo "索引正常，继续分析。"</w:t>
+              <w:br/>
+              <w:t>elif grep -qi "unindexed" "$RUN/bag_info.txt"; then</w:t>
+              <w:br/>
+              <w:t xml:space="preserve">  echo "索引缺失，恢复副本；原始文件保持不变。"</w:t>
+              <w:br/>
+              <w:t xml:space="preserve">  time rosbag reindex "$RAW"</w:t>
+              <w:br/>
+              <w:br/>
+              <w:t xml:space="preserve">  if ! rosbag info "$RAW" &gt; "$RUN/bag_info.txt" 2&gt;&amp;1; then</w:t>
+              <w:br/>
+              <w:t xml:space="preserve">    cat "$RUN/bag_info.txt"</w:t>
+              <w:br/>
+              <w:t xml:space="preserve">    echo "恢复后仍无法读取，停止分析。"</w:t>
               <w:br/>
               <w:t xml:space="preserve">    exit 1</w:t>
               <w:br/>
               <w:t xml:space="preserve">  fi</w:t>
               <w:br/>
-              <w:t>done</w:t>
-              <w:br/>
-              <w:br/>
-              <w:t>DS_CAM_COUNT="$(grep -Ec '^[[:space:]]*camera_model:[[:space:]]*ds[[:space:]]*$' "$CAMCHAIN" || true)"</w:t>
-              <w:br/>
-              <w:t>if [[ "$DS_CAM_COUNT" -ne 4 ]]; then</w:t>
-              <w:br/>
-              <w:t xml:space="preserve">  echo "相机链中 DS 相机数量为 $DS_CAM_COUNT（预期 4），停止。" &gt;&amp;2</w:t>
-              <w:br/>
-              <w:t xml:space="preserve">  echo "相机链：$CAMCHAIN" &gt;&amp;2</w:t>
+              <w:t xml:space="preserve">  echo "副本索引恢复成功，继续分析。"</w:t>
+              <w:br/>
+              <w:t>else</w:t>
+              <w:br/>
+              <w:t xml:space="preserve">  cat "$RUN/bag_info.txt"</w:t>
+              <w:br/>
+              <w:t xml:space="preserve">  echo "发现其他 BAG 读取错误，停止分析。"</w:t>
               <w:br/>
               <w:t xml:space="preserve">  exit 1</w:t>
               <w:br/>
               <w:t>fi</w:t>
               <w:br/>
               <w:br/>
-              <w:t>if [[ "$(docker inspect -f '{{.State.Running}}' kalibr 2&gt;/dev/null)" != "true" ]]; then</w:t>
-              <w:br/>
-              <w:t xml:space="preserve">  echo "Kalibr 容器 kalibr 未运行，请先启动容器。" &gt;&amp;2</w:t>
-              <w:br/>
-              <w:t xml:space="preserve">  exit 1</w:t>
+              <w:t>cat "$RUN/bag_info.txt"</w:t>
+              <w:br/>
+              <w:br/>
+              <w:t>echo "=== 2 检查 IMU 数据并生成独立配置 ==="</w:t>
+              <w:br/>
+              <w:br/>
+              <w:t>python3 - &lt;&lt;'PY'</w:t>
+              <w:br/>
+              <w:t>import os</w:t>
+              <w:br/>
+              <w:t>import json</w:t>
+              <w:br/>
+              <w:t>import math</w:t>
+              <w:br/>
+              <w:t>import yaml</w:t>
+              <w:br/>
+              <w:t>import numpy as np</w:t>
+              <w:br/>
+              <w:t>import rosbag</w:t>
+              <w:br/>
+              <w:br/>
+              <w:t>topic = os.environ["IMU_TOPIC"]</w:t>
+              <w:br/>
+              <w:t>rate_value = float(os.environ["IMU_RATE_HZ"])</w:t>
+              <w:br/>
+              <w:t>if (</w:t>
+              <w:br/>
+              <w:t xml:space="preserve">    not math.isfinite(rate_value)</w:t>
+              <w:br/>
+              <w:t xml:space="preserve">    or rate_value &lt;= 0</w:t>
+              <w:br/>
+              <w:t xml:space="preserve">    or not rate_value.is_integer()</w:t>
+              <w:br/>
+              <w:t>):</w:t>
+              <w:br/>
+              <w:t xml:space="preserve">    raise RuntimeError("请填写设备名义整数频率，例如 200")</w:t>
+              <w:br/>
+              <w:t>rate = int(rate_value)</w:t>
+              <w:br/>
+              <w:br/>
+              <w:t>count = backwards = duplicates = zero_stamps = nonfinite = 0</w:t>
+              <w:br/>
+              <w:t>previous = first = last = None</w:t>
+              <w:br/>
+              <w:t>intervals = []</w:t>
+              <w:br/>
+              <w:br/>
+              <w:t>with rosbag.Bag(os.environ["RAW"], "r") as bag:</w:t>
+              <w:br/>
+              <w:t xml:space="preserve">    topics = bag.get_type_and_topic_info().topics</w:t>
+              <w:br/>
+              <w:t xml:space="preserve">    if topic not in topics:</w:t>
+              <w:br/>
+              <w:t xml:space="preserve">        raise RuntimeError("BAG 缺少指定 IMU Topic：" + topic)</w:t>
+              <w:br/>
+              <w:t xml:space="preserve">    if topics[topic].msg_type != "sensor_msgs/Imu":</w:t>
+              <w:br/>
+              <w:t xml:space="preserve">        raise RuntimeError("指定 Topic 类型不是 sensor_msgs/Imu")</w:t>
+              <w:br/>
+              <w:br/>
+              <w:t xml:space="preserve">    for _, msg, _ in bag.read_messages(topics=[topic]):</w:t>
+              <w:br/>
+              <w:t xml:space="preserve">        stamp = msg.header.stamp.to_sec()</w:t>
+              <w:br/>
+              <w:t xml:space="preserve">        count += 1</w:t>
+              <w:br/>
+              <w:t xml:space="preserve">        if first is None:</w:t>
+              <w:br/>
+              <w:t xml:space="preserve">            first = stamp</w:t>
+              <w:br/>
+              <w:t xml:space="preserve">        last = stamp</w:t>
+              <w:br/>
+              <w:t xml:space="preserve">        zero_stamps += int(stamp == 0)</w:t>
+              <w:br/>
+              <w:br/>
+              <w:t xml:space="preserve">        values = [</w:t>
+              <w:br/>
+              <w:t xml:space="preserve">            msg.angular_velocity.x, msg.angular_velocity.y,</w:t>
+              <w:br/>
+              <w:t xml:space="preserve">            msg.angular_velocity.z, msg.linear_acceleration.x,</w:t>
+              <w:br/>
+              <w:t xml:space="preserve">            msg.linear_acceleration.y, msg.linear_acceleration.z,</w:t>
+              <w:br/>
+              <w:t xml:space="preserve">        ]</w:t>
+              <w:br/>
+              <w:t xml:space="preserve">        nonfinite += int(not np.isfinite(values).all())</w:t>
+              <w:br/>
+              <w:br/>
+              <w:t xml:space="preserve">        if previous is not None:</w:t>
+              <w:br/>
+              <w:t xml:space="preserve">            dt = stamp - previous</w:t>
+              <w:br/>
+              <w:t xml:space="preserve">            if dt &lt; 0:</w:t>
+              <w:br/>
+              <w:t xml:space="preserve">                backwards += 1</w:t>
+              <w:br/>
+              <w:t xml:space="preserve">            elif dt == 0:</w:t>
+              <w:br/>
+              <w:t xml:space="preserve">                duplicates += 1</w:t>
+              <w:br/>
+              <w:t xml:space="preserve">            else:</w:t>
+              <w:br/>
+              <w:t xml:space="preserve">                intervals.append(dt)</w:t>
+              <w:br/>
+              <w:t xml:space="preserve">        previous = stamp</w:t>
+              <w:br/>
+              <w:br/>
+              <w:t>check = {</w:t>
+              <w:br/>
+              <w:t xml:space="preserve">    "topic": topic,</w:t>
+              <w:br/>
+              <w:t xml:space="preserve">    "messages": count,</w:t>
+              <w:br/>
+              <w:t xml:space="preserve">    "header_span_seconds": None if first is None else last - first,</w:t>
+              <w:br/>
+              <w:t xml:space="preserve">    "backward_intervals_in_stored_order": backwards,</w:t>
+              <w:br/>
+              <w:t xml:space="preserve">    "duplicate_adjacent_stamps": duplicates,</w:t>
+              <w:br/>
+              <w:t xml:space="preserve">    "zero_stamps": zero_stamps,</w:t>
+              <w:br/>
+              <w:t xml:space="preserve">    "messages_with_nan_or_inf": nonfinite,</w:t>
+              <w:br/>
+              <w:t xml:space="preserve">    "nominal_rate_hz": rate,</w:t>
+              <w:br/>
+              <w:t>}</w:t>
+              <w:br/>
+              <w:t>if intervals:</w:t>
+              <w:br/>
+              <w:t xml:space="preserve">    dt = np.asarray(intervals)</w:t>
+              <w:br/>
+              <w:t xml:space="preserve">    measured = float(1.0 / np.median(dt))</w:t>
+              <w:br/>
+              <w:t xml:space="preserve">    check["rate_from_median_interval_hz"] = measured</w:t>
+              <w:br/>
+              <w:t xml:space="preserve">    check["rate_difference_percent"] = 100 * (measured / rate - 1)</w:t>
+              <w:br/>
+              <w:t xml:space="preserve">    check["largest_positive_interval_seconds"] = float(dt.max())</w:t>
+              <w:br/>
+              <w:br/>
+              <w:t>root = os.environ["RUN_INNER"]</w:t>
+              <w:br/>
+              <w:t>with open(root + "/input_check.json", "w") as f:</w:t>
+              <w:br/>
+              <w:t xml:space="preserve">    json.dump(check, f, ensure_ascii=False, indent=2)</w:t>
+              <w:br/>
+              <w:t>print(json.dumps(check, ensure_ascii=False, indent=2))</w:t>
+              <w:br/>
+              <w:br/>
+              <w:t>if count &lt; 2 or not intervals:</w:t>
+              <w:br/>
+              <w:t xml:space="preserve">    raise RuntimeError("有效 IMU 数据不足")</w:t>
+              <w:br/>
+              <w:t>if zero_stamps or nonfinite or duplicates:</w:t>
+              <w:br/>
+              <w:t xml:space="preserve">    raise RuntimeError("发现零时间戳、NaN/Inf 或相邻重复时间戳，停止")</w:t>
+              <w:br/>
+              <w:br/>
+              <w:t># 不自动替换名义频率，不修改消息时间戳</w:t>
+              <w:br/>
+              <w:t># 按消息数设置计数上限，避免提前截断输入尾部</w:t>
+              <w:br/>
+              <w:t>cfg = {</w:t>
+              <w:br/>
+              <w:t xml:space="preserve">    "imu_topic": topic,</w:t>
+              <w:br/>
+              <w:t xml:space="preserve">    "imu_rate": rate,</w:t>
+              <w:br/>
+              <w:t xml:space="preserve">    "measure_rate": rate,</w:t>
+              <w:br/>
+              <w:t xml:space="preserve">    "sequence_time": int(math.ceil(count / rate)),</w:t>
+              <w:br/>
+              <w:t>}</w:t>
+              <w:br/>
+              <w:t>with open(root + "/baai_ego.yaml", "w") as f:</w:t>
+              <w:br/>
+              <w:t xml:space="preserve">    yaml.safe_dump(cfg, f, sort_keys=False)</w:t>
+              <w:br/>
+              <w:br/>
+              <w:t>print("本次分析配置：")</w:t>
+              <w:br/>
+              <w:t>print(yaml.safe_dump(cfg, sort_keys=False))</w:t>
+              <w:br/>
+              <w:t>if backwards:</w:t>
+              <w:br/>
+              <w:t xml:space="preserve">    print("存储顺序有倒退，下一步 cookbag 将按时间戳排序。")</w:t>
+              <w:br/>
+              <w:t>if check["header_span_seconds"] &lt; 10800:</w:t>
+              <w:br/>
+              <w:t xml:space="preserve">    print("注意：少于官方建议的 3 小时，长时间漂移参数需进一步评估。")</w:t>
+              <w:br/>
+              <w:t>PY</w:t>
+              <w:br/>
+              <w:br/>
+              <w:t>echo "=== 3 按时间戳整理 cooked 副本 ==="</w:t>
+              <w:br/>
+              <w:br/>
+              <w:t>time rosrun allan_variance_ros cookbag.py \</w:t>
+              <w:br/>
+              <w:t xml:space="preserve">  --input "$RAW" \</w:t>
+              <w:br/>
+              <w:t xml:space="preserve">  --output "$COOKED"</w:t>
+              <w:br/>
+              <w:br/>
+              <w:t>test -s "$COOKED"</w:t>
+              <w:br/>
+              <w:t>rosbag info "$COOKED" | tee "$RUN/cooked_bag_info.txt"</w:t>
+              <w:br/>
+              <w:br/>
+              <w:t># 使用独立分析容器内的本地 ROS Master，不连接头环</w:t>
+              <w:br/>
+              <w:t>export ROS_MASTER_URI=http://127.0.0.1:11321</w:t>
+              <w:br/>
+              <w:t>export ROS_IP=127.0.0.1</w:t>
+              <w:br/>
+              <w:t>MASTER_PID=""</w:t>
+              <w:br/>
+              <w:br/>
+              <w:t>cleanup_master() {</w:t>
+              <w:br/>
+              <w:t xml:space="preserve">  if [[ -n "$MASTER_PID" ]]; then</w:t>
+              <w:br/>
+              <w:t xml:space="preserve">    kill -TERM "$MASTER_PID" 2&gt;/dev/null || true</w:t>
+              <w:br/>
+              <w:t xml:space="preserve">    wait "$MASTER_PID" 2&gt;/dev/null || true</w:t>
+              <w:br/>
+              <w:t xml:space="preserve">  fi</w:t>
+              <w:br/>
+              <w:t>}</w:t>
+              <w:br/>
+              <w:t>trap cleanup_master EXIT</w:t>
+              <w:br/>
+              <w:br/>
+              <w:t>if ! python3 -c 'import rosgraph; rosgraph.Master("/allan_check").getPid()' &gt;/dev/null 2&gt;&amp;1; then</w:t>
+              <w:br/>
+              <w:t xml:space="preserve">  roscore -p 11321 &gt; "$RUN/roscore.log" 2&gt;&amp;1 &amp;</w:t>
+              <w:br/>
+              <w:t xml:space="preserve">  MASTER_PID=$!</w:t>
+              <w:br/>
+              <w:t xml:space="preserve">  READY=no</w:t>
+              <w:br/>
+              <w:br/>
+              <w:t xml:space="preserve">  for i in {1..15}; do</w:t>
+              <w:br/>
+              <w:t xml:space="preserve">    if python3 -c 'import rosgraph; rosgraph.Master("/allan_check").getPid()' &gt;/dev/null 2&gt;&amp;1; then</w:t>
+              <w:br/>
+              <w:t xml:space="preserve">      READY=yes</w:t>
+              <w:br/>
+              <w:t xml:space="preserve">      break</w:t>
+              <w:br/>
+              <w:t xml:space="preserve">    fi</w:t>
+              <w:br/>
+              <w:t xml:space="preserve">    sleep 1</w:t>
+              <w:br/>
+              <w:t xml:space="preserve">  done</w:t>
+              <w:br/>
+              <w:br/>
+              <w:t xml:space="preserve">  [[ "$READY" == yes ]] || {</w:t>
+              <w:br/>
+              <w:t xml:space="preserve">    echo "容器本地 ROS Master 未就绪，停止。"</w:t>
+              <w:br/>
+              <w:t xml:space="preserve">    exit 1</w:t>
+              <w:br/>
+              <w:t xml:space="preserve">  }</w:t>
               <w:br/>
               <w:t>fi</w:t>
               <w:br/>
               <w:br/>
-              <w:t>if [[ -e "$RUN_DIR" ]]; then</w:t>
-              <w:br/>
-              <w:t xml:space="preserve">  echo "测试目录已存在，为避免覆盖而停止：$RUN_DIR" &gt;&amp;2</w:t>
-              <w:br/>
-              <w:t xml:space="preserve">  exit 2</w:t>
+              <w:t>echo "=== 4 计算 Allan 方差 ==="</w:t>
+              <w:br/>
+              <w:br/>
+              <w:t># cooked 目录只有一个 BAG，避免重复处理原始或备份 BAG</w:t>
+              <w:br/>
+              <w:t>time rosrun allan_variance_ros allan_variance \</w:t>
+              <w:br/>
+              <w:t xml:space="preserve">  "$RUN/cooked/" "$RUN/baai_ego.yaml"</w:t>
+              <w:br/>
+              <w:br/>
+              <w:t>test -s "$RUN/cooked/allan_variance.csv"</w:t>
+              <w:br/>
+              <w:t>cp "$RUN/cooked/allan_variance.csv" "$RUN/allan_variance.csv"</w:t>
+              <w:br/>
+              <w:br/>
+              <w:t>echo "=== 5 生成 IMU 参数与曲线 ==="</w:t>
+              <w:br/>
+              <w:br/>
+              <w:t>time rosrun allan_variance_ros analysis.py \</w:t>
+              <w:br/>
+              <w:t xml:space="preserve">  --data "$RUN/allan_variance.csv" \</w:t>
+              <w:br/>
+              <w:t xml:space="preserve">  --config "$RUN/baai_ego.yaml" \</w:t>
+              <w:br/>
+              <w:t xml:space="preserve">  --output "$RUN/imu.yaml"</w:t>
+              <w:br/>
+              <w:br/>
+              <w:t>echo "=== 6 检查结果完整性 ==="</w:t>
+              <w:br/>
+              <w:br/>
+              <w:t>python3 - &lt;&lt;'PY'</w:t>
+              <w:br/>
+              <w:t>import os</w:t>
+              <w:br/>
+              <w:t>import math</w:t>
+              <w:br/>
+              <w:t>import yaml</w:t>
+              <w:br/>
+              <w:br/>
+              <w:t>root = os.environ["RUN_INNER"]</w:t>
+              <w:br/>
+              <w:t>for name in ("imu.yaml", "allan_variance.csv", "acceleration.png", "gyro.png"):</w:t>
+              <w:br/>
+              <w:t xml:space="preserve">    path = os.path.join(root, name)</w:t>
+              <w:br/>
+              <w:t xml:space="preserve">    if not os.path.isfile(path) or os.path.getsize(path) == 0:</w:t>
+              <w:br/>
+              <w:t xml:space="preserve">        raise RuntimeError("缺少结果文件：" + name)</w:t>
+              <w:br/>
+              <w:br/>
+              <w:t>with open(root + "/imu.yaml") as f:</w:t>
+              <w:br/>
+              <w:t xml:space="preserve">    imu = yaml.safe_load(f)</w:t>
+              <w:br/>
+              <w:t>for key in (</w:t>
+              <w:br/>
+              <w:t xml:space="preserve">    "accelerometer_noise_density", "accelerometer_random_walk",</w:t>
+              <w:br/>
+              <w:t xml:space="preserve">    "gyroscope_noise_density", "gyroscope_random_walk",</w:t>
+              <w:br/>
+              <w:t>):</w:t>
+              <w:br/>
+              <w:t xml:space="preserve">    value = float(imu[key])</w:t>
+              <w:br/>
+              <w:t xml:space="preserve">    if not math.isfinite(value) or value &lt;= 0:</w:t>
+              <w:br/>
+              <w:t xml:space="preserve">        raise RuntimeError("噪声参数不是有限正数：" + key)</w:t>
+              <w:br/>
+              <w:br/>
+              <w:t>if imu.get("rostopic") != os.environ["IMU_TOPIC"]:</w:t>
+              <w:br/>
+              <w:t xml:space="preserve">    raise RuntimeError("输出 IMU Topic 不匹配")</w:t>
+              <w:br/>
+              <w:t>if float(imu["update_rate"]) != float(os.environ["IMU_RATE_HZ"]):</w:t>
+              <w:br/>
+              <w:t xml:space="preserve">    raise RuntimeError("输出 IMU 频率不匹配")</w:t>
+              <w:br/>
+              <w:br/>
+              <w:t>print("参数、CSV 和两张曲线已生成，四项噪声参数为有限正数。")</w:t>
+              <w:br/>
+              <w:t>print("这只是输出完整性检查，不代表参数质量已通过评估。")</w:t>
+              <w:br/>
+              <w:t>PY</w:t>
+              <w:br/>
+              <w:br/>
+              <w:t>cat "$RUN/imu.yaml"</w:t>
+              <w:br/>
+              <w:t>CONTAINER_SCRIPT</w:t>
+              <w:br/>
+              <w:br/>
+              <w:t>PIPE_RESULTS=("${PIPESTATUS[@]}")</w:t>
+              <w:br/>
+              <w:t>ANALYSIS_RC="${PIPE_RESULTS[0]}"</w:t>
+              <w:br/>
+              <w:t>LOG_RC="${PIPE_RESULTS[1]}"</w:t>
+              <w:br/>
+              <w:t>set -e</w:t>
+              <w:br/>
+              <w:br/>
+              <w:t># 确认原始 BAG 在处理期间没有发生变化</w:t>
+              <w:br/>
+              <w:t>AFTER_SHA="$(sha256sum "$SOURCE_BAG" | awk '{print $1}')"</w:t>
+              <w:br/>
+              <w:t>SOURCE_UNCHANGED=no</w:t>
+              <w:br/>
+              <w:t>[[ "$SOURCE_SHA" == "$AFTER_SHA" ]] &amp;&amp; SOURCE_UNCHANGED=yes</w:t>
+              <w:br/>
+              <w:br/>
+              <w:t>STATUS=INCOMPLETE_OR_FAILED</w:t>
+              <w:br/>
+              <w:t>if [[ "$ANALYSIS_RC" -eq 0 &amp;&amp;</w:t>
+              <w:br/>
+              <w:t xml:space="preserve">      "$LOG_RC" -eq 0 &amp;&amp;</w:t>
+              <w:br/>
+              <w:t xml:space="preserve">      "$SOURCE_UNCHANGED" == yes ]]; then</w:t>
+              <w:br/>
+              <w:t xml:space="preserve">  STATUS=SUCCESS_COMPLETE</w:t>
               <w:br/>
               <w:t>fi</w:t>
               <w:br/>
               <w:br/>
-              <w:t>mkdir -p "$RUN_DIR"</w:t>
-              <w:br/>
-              <w:t>cp -v -- "$SOURCE_BAG" "$RUN_DIR/$BAG_NAME"</w:t>
-              <w:br/>
-              <w:br/>
-              <w:t>SOURCE_SHA256="$(sha256sum "$SOURCE_BAG" | awk '{print $1}')"</w:t>
-              <w:br/>
-              <w:t>COPY_SHA256="$(sha256sum "$RUN_DIR/$BAG_NAME" | awk '{print $1}')"</w:t>
-              <w:br/>
-              <w:t>if [[ "$SOURCE_SHA256" != "$COPY_SHA256" ]]; then</w:t>
-              <w:br/>
-              <w:t xml:space="preserve">  echo "BAG 副本 SHA256 校验失败，停止。" &gt;&amp;2</w:t>
-              <w:br/>
-              <w:t xml:space="preserve">  exit 3</w:t>
-              <w:br/>
-              <w:t>fi</w:t>
-              <w:br/>
-              <w:br/>
-              <w:t># 先确认副本可读且包含四路压缩图像与 IMU topic</w:t>
-              <w:br/>
-              <w:t>set +e</w:t>
-              <w:br/>
-              <w:t>docker exec \</w:t>
-              <w:br/>
-              <w:t xml:space="preserve">  -e BAG_INNER="$BAG_INNER" \</w:t>
-              <w:br/>
-              <w:t xml:space="preserve">  kalibr bash -lc '</w:t>
-              <w:br/>
-              <w:t>source /opt/ros/noetic/setup.bash</w:t>
-              <w:br/>
-              <w:t>rosbag info "$BAG_INNER"</w:t>
-              <w:br/>
-              <w:t>' 2&gt;&amp;1 | tee "$BAG_INFO"</w:t>
-              <w:br/>
-              <w:t>BAG_INFO_EXIT_CODE="${PIPESTATUS[0]}"</w:t>
-              <w:br/>
-              <w:t>set -e</w:t>
-              <w:br/>
-              <w:br/>
-              <w:t>if [[ "$BAG_INFO_EXIT_CODE" -ne 0 ]]; then</w:t>
-              <w:br/>
-              <w:t xml:space="preserve">  echo "rosbag info 无法读取 BAG；尚未启动联合标定。" &gt;&amp;2</w:t>
-              <w:br/>
-              <w:t xml:space="preserve">  exit 4</w:t>
-              <w:br/>
-              <w:t>fi</w:t>
-              <w:br/>
-              <w:br/>
-              <w:t>for TOPIC in \</w:t>
-              <w:br/>
-              <w:t xml:space="preserve">  /fisheye/left/image_raw/compressed \</w:t>
-              <w:br/>
-              <w:t xml:space="preserve">  /fisheye/right/image_raw/compressed \</w:t>
-              <w:br/>
-              <w:t xml:space="preserve">  /fisheye/bright/image_raw/compressed \</w:t>
-              <w:br/>
-              <w:t xml:space="preserve">  /fisheye/bleft/image_raw/compressed \</w:t>
-              <w:br/>
-              <w:t xml:space="preserve">  /imu_data_raw</w:t>
-              <w:br/>
-              <w:t>do</w:t>
-              <w:br/>
-              <w:t xml:space="preserve">  if ! grep -Fq "$TOPIC" "$BAG_INFO"; then</w:t>
-              <w:br/>
-              <w:t xml:space="preserve">    echo "BAG 缺少所需 topic：$TOPIC；尚未启动联合标定。" &gt;&amp;2</w:t>
-              <w:br/>
-              <w:t xml:space="preserve">    exit 5</w:t>
-              <w:br/>
-              <w:t xml:space="preserve">  fi</w:t>
-              <w:br/>
-              <w:t>done</w:t>
+              <w:t>{</w:t>
+              <w:br/>
+              <w:t xml:space="preserve">  printf 'end_utc=%s\n' "$(date -u +%Y-%m-%dT%H:%M:%SZ)"</w:t>
+              <w:br/>
+              <w:t xml:space="preserve">  printf 'analysis_exit_code=%s\n' "$ANALYSIS_RC"</w:t>
+              <w:br/>
+              <w:t xml:space="preserve">  printf 'log_exit_code=%s\n' "$LOG_RC"</w:t>
+              <w:br/>
+              <w:t xml:space="preserve">  printf 'source_unchanged=%s\n' "$SOURCE_UNCHANGED"</w:t>
+              <w:br/>
+              <w:t xml:space="preserve">  printf 'status=%s\n' "$STATUS"</w:t>
+              <w:br/>
+              <w:t>} | tee -a "$RUN_DIR/run_metadata.txt"</w:t>
               <w:br/>
               <w:br/>
               <w:t>echo</w:t>
               <w:br/>
-              <w:t>echo "第三步：DS Camera-IMU 联合标定"</w:t>
-              <w:br/>
-              <w:t>echo "设备目录：$DEVICE_DIR"</w:t>
-              <w:br/>
-              <w:t>echo "第一步相机链：$CAMCHAIN"</w:t>
-              <w:br/>
-              <w:t>echo "第二步 IMU 配置：$IMU_YAML"</w:t>
-              <w:br/>
-              <w:t>echo "第三步动态 BAG：$SOURCE_BAG"</w:t>
-              <w:br/>
-              <w:t>echo "抽帧频率：5.0 Hz（原文档参数）"</w:t>
-              <w:br/>
-              <w:t>echo "时间偏移：Kalibr 默认范围"</w:t>
-              <w:br/>
-              <w:t>echo "独立输出目录：$RUN_DIR"</w:t>
-              <w:br/>
-              <w:t>echo "运行期间请勿关闭终端或按 Ctrl+C。"</w:t>
-              <w:br/>
-              <w:br/>
-              <w:t>KALIBR_START_UTC="$(date -u +%Y-%m-%dT%H:%M:%SZ)"</w:t>
-              <w:br/>
-              <w:t>KALIBR_START_SECONDS="$(date +%s)"</w:t>
-              <w:br/>
-              <w:br/>
-              <w:t>set +e</w:t>
-              <w:br/>
-              <w:t>docker exec \</w:t>
-              <w:br/>
-              <w:t xml:space="preserve">  -e BAG_INNER="$BAG_INNER" \</w:t>
-              <w:br/>
-              <w:t xml:space="preserve">  -e CAMCHAIN_INNER="$CAMCHAIN_INNER" \</w:t>
-              <w:br/>
-              <w:t xml:space="preserve">  -e IMU_INNER="$IMU_INNER" \</w:t>
-              <w:br/>
-              <w:t xml:space="preserve">  -e TARGET_INNER="$TARGET_INNER" \</w:t>
-              <w:br/>
-              <w:t xml:space="preserve">  -e RUN_DIR_INNER="$RUN_DIR_INNER" \</w:t>
-              <w:br/>
-              <w:t xml:space="preserve">  kalibr bash -lc '</w:t>
-              <w:br/>
-              <w:t>set -e</w:t>
-              <w:br/>
-              <w:t>source /opt/ros/noetic/setup.bash</w:t>
-              <w:br/>
-              <w:t>source /catkin_ws/devel/setup.bash</w:t>
-              <w:br/>
-              <w:t>export MPLBACKEND=Agg</w:t>
-              <w:br/>
-              <w:t>unset DISPLAY</w:t>
-              <w:br/>
-              <w:t>cd "$RUN_DIR_INNER"</w:t>
-              <w:br/>
-              <w:br/>
-              <w:t>rosrun kalibr kalibr_calibrate_imu_camera \</w:t>
-              <w:br/>
-              <w:t xml:space="preserve">  --target "$TARGET_INNER" \</w:t>
-              <w:br/>
-              <w:t xml:space="preserve">  --imu "$IMU_INNER" \</w:t>
-              <w:br/>
-              <w:t xml:space="preserve">  --cams "$CAMCHAIN_INNER" \</w:t>
-              <w:br/>
-              <w:t xml:space="preserve">  --bag "$BAG_INNER" \</w:t>
-              <w:br/>
-              <w:t xml:space="preserve">  --bag-freq 5.0</w:t>
-              <w:br/>
-              <w:t>' 2&gt;&amp;1 | tee "$LOG_FILE"</w:t>
-              <w:br/>
-              <w:t>KALIBR_EXIT_CODE="${PIPESTATUS[0]}"</w:t>
-              <w:br/>
-              <w:t>set -e</w:t>
-              <w:br/>
-              <w:br/>
-              <w:t>KALIBR_END_UTC="$(date -u +%Y-%m-%dT%H:%M:%SZ)"</w:t>
-              <w:br/>
-              <w:t>KALIBR_SECONDS="$(( $(date +%s) - KALIBR_START_SECONDS ))"</w:t>
-              <w:br/>
-              <w:br/>
-              <w:t>CAMCHAIN_OK=no</w:t>
-              <w:br/>
-              <w:t>IMU_OUT_OK=no</w:t>
-              <w:br/>
-              <w:t>RESULTS_OK=no</w:t>
-              <w:br/>
-              <w:t>REPORT_OK=no</w:t>
-              <w:br/>
-              <w:t>[[ -s "$CAMCHAIN_OUT" ]] &amp;&amp; CAMCHAIN_OK=yes</w:t>
-              <w:br/>
-              <w:t>[[ -s "$IMU_OUT" ]] &amp;&amp; IMU_OUT_OK=yes</w:t>
-              <w:br/>
-              <w:t>[[ -s "$RESULTS_OUT" ]] &amp;&amp; RESULTS_OK=yes</w:t>
-              <w:br/>
-              <w:t>[[ -s "$REPORT_OUT" ]] &amp;&amp; REPORT_OK=yes</w:t>
-              <w:br/>
-              <w:br/>
-              <w:t>if [[ "$KALIBR_EXIT_CODE" -eq 0 &amp;&amp;</w:t>
-              <w:br/>
-              <w:t xml:space="preserve">      "$CAMCHAIN_OK" == yes &amp;&amp;</w:t>
-              <w:br/>
-              <w:t xml:space="preserve">      "$IMU_OUT_OK" == yes &amp;&amp;</w:t>
-              <w:br/>
-              <w:t xml:space="preserve">      "$RESULTS_OK" == yes &amp;&amp;</w:t>
-              <w:br/>
-              <w:t xml:space="preserve">      "$REPORT_OK" == yes ]]; then</w:t>
-              <w:br/>
-              <w:t xml:space="preserve">  STATUS=SUCCESS_COMPLETE</w:t>
-              <w:br/>
-              <w:t>else</w:t>
-              <w:br/>
-              <w:t xml:space="preserve">  STATUS=INCOMPLETE_OR_FAILED</w:t>
-              <w:br/>
-              <w:t>fi</w:t>
-              <w:br/>
-              <w:br/>
-              <w:t>TOTAL_END_UTC="$(date -u +%Y-%m-%dT%H:%M:%SZ)"</w:t>
-              <w:br/>
-              <w:t>TOTAL_SECONDS="$(( $(date +%s) - TOTAL_START_SECONDS ))"</w:t>
-              <w:br/>
-              <w:br/>
-              <w:t>{</w:t>
-              <w:br/>
-              <w:t xml:space="preserve">  printf 'step=step3_camera_imu_joint_calibration\n'</w:t>
-              <w:br/>
-              <w:t xml:space="preserve">  printf 'device_dir=%s\n' "$DEVICE_DIR"</w:t>
-              <w:br/>
-              <w:t xml:space="preserve">  printf 'camera_bag_base=%s\n' "$CAMERA_BAG_BASE"</w:t>
-              <w:br/>
-              <w:t xml:space="preserve">  printf 'camera_model_source=step1_camchain_DS_x4\n'</w:t>
-              <w:br/>
-              <w:t xml:space="preserve">  printf 'camera_imu_bag=%s\n' "$SOURCE_BAG"</w:t>
-              <w:br/>
-              <w:t xml:space="preserve">  printf 'bag_frequency_hz=5.0\n'</w:t>
-              <w:br/>
-              <w:t xml:space="preserve">  printf 'timeoffset_padding=Kalibr_default\n'</w:t>
-              <w:br/>
-              <w:t xml:space="preserve">  printf 'bag_sha256=%s\n' "$COPY_SHA256"</w:t>
-              <w:br/>
-              <w:t xml:space="preserve">  printf 'total_start_utc=%s\n' "$TOTAL_START_UTC"</w:t>
-              <w:br/>
-              <w:t xml:space="preserve">  printf 'total_end_utc=%s\n' "$TOTAL_END_UTC"</w:t>
-              <w:br/>
-              <w:t xml:space="preserve">  printf 'total_wall_seconds=%s\n' "$TOTAL_SECONDS"</w:t>
-              <w:br/>
-              <w:t xml:space="preserve">  printf 'total_wall_minutes_seconds=%s分%s秒\n' \</w:t>
-              <w:br/>
-              <w:t xml:space="preserve">    "$((TOTAL_SECONDS / 60))" "$((TOTAL_SECONDS % 60))"</w:t>
-              <w:br/>
-              <w:t xml:space="preserve">  printf 'kalibr_start_utc=%s\n' "$KALIBR_START_UTC"</w:t>
-              <w:br/>
-              <w:t xml:space="preserve">  printf 'kalibr_end_utc=%s\n' "$KALIBR_END_UTC"</w:t>
-              <w:br/>
-              <w:t xml:space="preserve">  printf 'kalibr_wall_seconds=%s\n' "$KALIBR_SECONDS"</w:t>
-              <w:br/>
-              <w:t xml:space="preserve">  printf 'kalibr_exit_code=%s\n' "$KALIBR_EXIT_CODE"</w:t>
-              <w:br/>
-              <w:t xml:space="preserve">  printf 'camchain_imucam_exists=%s\n' "$CAMCHAIN_OK"</w:t>
-              <w:br/>
-              <w:t xml:space="preserve">  printf 'imu_output_exists=%s\n' "$IMU_OUT_OK"</w:t>
-              <w:br/>
-              <w:t xml:space="preserve">  printf 'results_imucam_exists=%s\n' "$RESULTS_OK"</w:t>
-              <w:br/>
-              <w:t xml:space="preserve">  printf 'report_imucam_exists=%s\n' "$REPORT_OK"</w:t>
-              <w:br/>
-              <w:t xml:space="preserve">  printf 'completion_status=%s\n' "$STATUS"</w:t>
-              <w:br/>
-              <w:t>} | tee "$METADATA"</w:t>
-              <w:br/>
-              <w:br/>
-              <w:t>echo</w:t>
-              <w:br/>
-              <w:t>echo "=== 本次测试文件 ==="</w:t>
-              <w:br/>
               <w:t>ls -lh "$RUN_DIR"</w:t>
               <w:br/>
-              <w:br/>
-              <w:t>echo</w:t>
-              <w:br/>
               <w:t>echo "状态：$STATUS"</w:t>
               <w:br/>
               <w:t>echo "结果目录：$RUN_DIR"</w:t>
+              <w:br/>
+              <w:t>echo "后续 Camera-IMU 使用的参数路径：$RUN_DIR/imu.yaml"</w:t>
               <w:br/>
               <w:br/>
               <w:t>[[ "$STATUS" == SUCCESS_COMPLETE ]]</w:t>
@@ -4505,9 +4931,666 @@
         <w:jc w:val="left"/>
       </w:pPr>
     </w:p>
+    <w:p>
+      <w:pPr>
+        <w:spacing w:before="120" w:after="120" w:line="288" w:lineRule="auto"/>
+        <w:ind w:left="0"/>
+        <w:jc w:val="left"/>
+      </w:pPr>
+    </w:p>
+    <w:p>
+      <w:pPr>
+        <w:spacing w:before="120" w:after="120" w:line="288" w:lineRule="auto"/>
+        <w:ind w:left="0"/>
+        <w:jc w:val="left"/>
+      </w:pPr>
+    </w:p>
+    <w:p>
+      <w:pPr>
+        <w:spacing w:before="120" w:after="120" w:line="288" w:lineRule="auto"/>
+        <w:ind w:left="0"/>
+        <w:jc w:val="left"/>
+      </w:pPr>
+    </w:p>
+    <w:p>
+      <w:pPr>
+        <w:spacing w:before="120" w:after="120" w:line="288" w:lineRule="auto"/>
+        <w:ind w:left="0"/>
+        <w:jc w:val="left"/>
+      </w:pPr>
+    </w:p>
+    <w:p>
+      <w:pPr>
+        <w:spacing w:before="120" w:after="120" w:line="288" w:lineRule="auto"/>
+        <w:ind w:left="0"/>
+        <w:jc w:val="left"/>
+      </w:pPr>
+    </w:p>
+    <w:p>
+      <w:pPr>
+        <w:spacing w:before="120" w:after="120" w:line="288" w:lineRule="auto"/>
+        <w:ind w:left="0"/>
+        <w:jc w:val="left"/>
+      </w:pPr>
+    </w:p>
+    <w:p>
+      <w:pPr>
+        <w:spacing w:before="120" w:after="120" w:line="288" w:lineRule="auto"/>
+        <w:ind w:left="0"/>
+        <w:jc w:val="left"/>
+      </w:pPr>
+    </w:p>
+    <w:p>
+      <w:pPr>
+        <w:pStyle w:val="1"/>
+        <w:spacing w:before="380" w:after="140" w:line="288" w:lineRule="auto"/>
+        <w:ind w:left="0"/>
+        <w:jc w:val="left"/>
+        <w:outlineLvl w:val="0"/>
+      </w:pPr>
+      <w:bookmarkStart w:name="heading_18" w:id="18"/>
+      <w:r>
+        <w:rPr>
+          <w:rFonts w:eastAsia="等线" w:ascii="Arial" w:cs="Arial" w:hAnsi="Arial"/>
+          <w:b w:val="true"/>
+          <w:sz w:val="36"/>
+        </w:rPr>
+        <w:t>四 附：camera_imu   DS验证命令</w:t>
+        <w:br/>
+      </w:r>
+      <w:bookmarkEnd w:id="18"/>
+    </w:p>
+    <w:tbl>
+      <w:tblPr>
+        <w:tblW w:w="0" w:type="auto"/>
+        <w:tblInd w:w="0" w:type="dxa"/>
+        <w:tblBorders>
+          <w:top w:val="single" w:color="dee0e3"/>
+          <w:left w:val="single" w:color="dee0e3"/>
+          <w:bottom w:val="single" w:color="dee0e3"/>
+          <w:right w:val="single" w:color="dee0e3"/>
+          <w:insideH w:val="single" w:color="dee0e3"/>
+          <w:insideV w:val="single" w:color="dee0e3"/>
+        </w:tblBorders>
+        <w:tblLayout w:type="fixed"/>
+      </w:tblPr>
+      <w:tblGrid>
+        <w:gridCol w:w="8280"/>
+      </w:tblGrid>
+      <w:tr>
+        <w:tc>
+          <w:tcPr>
+            <w:tcW w:w="8280" w:type="dxa"/>
+            <w:shd w:color="auto" w:val="clear" w:fill="f5f6f7"/>
+            <w:tcMar>
+              <w:top w:type="dxa" w:w="60"/>
+              <w:left w:type="dxa" w:w="120"/>
+              <w:bottom w:type="dxa" w:w="30"/>
+              <w:right w:type="dxa" w:w="120"/>
+            </w:tcMar>
+          </w:tcPr>
+          <w:p>
+            <w:pPr>
+              <w:spacing w:before="120" w:after="120" w:line="288" w:lineRule="auto"/>
+              <w:jc w:val="left"/>
+            </w:pPr>
+            <w:r>
+              <w:rPr>
+                <w:rFonts w:eastAsia="Consolas" w:ascii="Consolas" w:cs="Consolas" w:hAnsi="Consolas"/>
+                <w:color w:val="646a73"/>
+                <w:sz w:val="22"/>
+              </w:rPr>
+              <w:t>Bash</w:t>
+              <w:br w:type="textWrapping"/>
+            </w:r>
+            <w:r>
+              <w:rPr>
+                <w:rFonts w:eastAsia="Consolas" w:ascii="Consolas" w:cs="Consolas" w:hAnsi="Consolas"/>
+                <w:sz w:val="22"/>
+              </w:rPr>
+              <w:t>(</w:t>
+              <w:br/>
+              <w:t>set -Eeuo pipefail</w:t>
+              <w:br/>
+              <w:br/>
+              <w:t># ================= 每次使用时修改以下 4 行 =================</w:t>
+              <w:br/>
+              <w:br/>
+              <w:t># ① 第三步：本次 Camera-IMU 动态 BAG 的完整路径</w:t>
+              <w:br/>
+              <w:t># 必须已经正常结束录制，包含四路压缩图像和 /imu_data_raw</w:t>
+              <w:br/>
+              <w:t>SOURCE_BAG="/home/key/文档/kalibr/data/cp-0003/camera_imu/camera_imu_cp0003_1014_1635.bag"</w:t>
+              <w:br/>
+              <w:br/>
+              <w:t># ② 第一步：同一台头环 camera 标定成功生成的 DS 相机链完整路径</w:t>
+              <w:br/>
+              <w:t># 日期时间对应第一步 camera BAG，不是上面的 Camera-IMU 动态 BAG</w:t>
+              <w:br/>
+              <w:t>CAMCHAIN="/home/key/文档/kalibr/data/cp-0003/camera/camera_cp0003_1014_1530-camchain.yaml"</w:t>
+              <w:br/>
+              <w:br/>
+              <w:t># ③ 第二步：同一台头环 IMU 分析生成的 imu.yaml 完整路径</w:t>
+              <w:br/>
+              <w:t># 如果文件仍在 allan_runs 子目录中，填写该文件的实际完整路径</w:t>
+              <w:br/>
+              <w:t>IMU_YAML="/home/key/文档/kalibr/data/cp-0003/imu/imu.yaml"</w:t>
+              <w:br/>
+              <w:br/>
+              <w:t># ④ 本次结果保存的父目录</w:t>
+              <w:br/>
+              <w:t># 自动在此目录下创建 ds_joint_tests/UTC时间戳/，不覆盖已有结果</w:t>
+              <w:br/>
+              <w:t>OUTPUT_ROOT="/home/key/文档/kalibr/data/cp-0003/camera_imu"</w:t>
+              <w:br/>
+              <w:br/>
+              <w:t># ==========================================================</w:t>
+              <w:br/>
+              <w:br/>
+              <w:t># 以下为当前工作站固定设置，日常更换设备或 BAG 时不需要修改</w:t>
+              <w:br/>
+              <w:t>CONTAINER="kalibr"</w:t>
+              <w:br/>
+              <w:t>DATA_ROOT="/home/key/文档/kalibr/data"</w:t>
+              <w:br/>
+              <w:t>TARGET="$DATA_ROOT/april_6x6.yaml"</w:t>
+              <w:br/>
+              <w:t>BAG_FREQ_HZ="5.0"</w:t>
+              <w:br/>
+              <w:br/>
+              <w:t>RUN_DIR=""</w:t>
+              <w:br/>
+              <w:t>TOTAL_START="$(date +%s)"</w:t>
+              <w:br/>
+              <w:br/>
+              <w:t># 无论成功还是失败，都显示退出码并保留终端窗口</w:t>
+              <w:br/>
+              <w:t>finish() {</w:t>
+              <w:br/>
+              <w:t xml:space="preserve">  RC=$?</w:t>
+              <w:br/>
+              <w:t xml:space="preserve">  trap - EXIT</w:t>
+              <w:br/>
+              <w:t xml:space="preserve">  set +e</w:t>
+              <w:br/>
+              <w:t xml:space="preserve">  if [[ -n "$RUN_DIR" &amp;&amp; -d "$RUN_DIR" ]]; then</w:t>
+              <w:br/>
+              <w:t xml:space="preserve">    printf 'script_exit_code=%s\ntotal_wall_seconds=%s\n' \</w:t>
+              <w:br/>
+              <w:t xml:space="preserve">      "$RC" "$(( $(date +%s) - TOTAL_START ))" \</w:t>
+              <w:br/>
+              <w:t xml:space="preserve">      &gt; "$RUN_DIR/completion.txt"</w:t>
+              <w:br/>
+              <w:t xml:space="preserve">  fi</w:t>
+              <w:br/>
+              <w:t xml:space="preserve">  printf '\n脚本结束，退出码：%s\n结果目录：%s\n' "$RC" "$RUN_DIR"</w:t>
+              <w:br/>
+              <w:t xml:space="preserve">  read -r -p "按回车关闭窗口..." _ || true</w:t>
+              <w:br/>
+              <w:t xml:space="preserve">  exit "$RC"</w:t>
+              <w:br/>
+              <w:t>}</w:t>
+              <w:br/>
+              <w:t>trap finish EXIT</w:t>
+              <w:br/>
+              <w:br/>
+              <w:t># 检查输入文件；尚未生成相机链或 IMU 参数时停止</w:t>
+              <w:br/>
+              <w:t>for FILE in "$SOURCE_BAG" "$CAMCHAIN" "$IMU_YAML" "$TARGET"; do</w:t>
+              <w:br/>
+              <w:t xml:space="preserve">  [[ -s "$FILE" ]] || {</w:t>
+              <w:br/>
+              <w:t xml:space="preserve">    echo "文件不存在或为空：$FILE"</w:t>
+              <w:br/>
+              <w:t xml:space="preserve">    exit 1</w:t>
+              <w:br/>
+              <w:t xml:space="preserve">  }</w:t>
+              <w:br/>
+              <w:t>done</w:t>
+              <w:br/>
+              <w:br/>
+              <w:t>[[ "$SOURCE_BAG" == *.bag ]] || {</w:t>
+              <w:br/>
+              <w:t xml:space="preserve">  echo "请使用已封存的 .bag 文件，不直接使用 .bag.active。"</w:t>
+              <w:br/>
+              <w:t xml:space="preserve">  exit 1</w:t>
+              <w:br/>
+              <w:t>}</w:t>
+              <w:br/>
+              <w:br/>
+              <w:t># 规范化路径，防止输出落到容器未挂载的位置</w:t>
+              <w:br/>
+              <w:t>DATA_ROOT="$(realpath -e "$DATA_ROOT")"</w:t>
+              <w:br/>
+              <w:t>OUTPUT_ROOT="$(realpath -m "$OUTPUT_ROOT")"</w:t>
+              <w:br/>
+              <w:t>if [[ "$OUTPUT_ROOT" != "$DATA_ROOT" &amp;&amp;</w:t>
+              <w:br/>
+              <w:t xml:space="preserve">      "$OUTPUT_ROOT" != "$DATA_ROOT/"* ]]; then</w:t>
+              <w:br/>
+              <w:t xml:space="preserve">  echo "结果父目录必须位于：$DATA_ROOT"</w:t>
+              <w:br/>
+              <w:t xml:space="preserve">  exit 1</w:t>
+              <w:br/>
+              <w:t>fi</w:t>
+              <w:br/>
+              <w:br/>
+              <w:t># 检查容器状态及 /data 挂载，不自动重启现有容器</w:t>
+              <w:br/>
+              <w:t>[[ "$(docker inspect -f '{{.State.Running}}' "$CONTAINER" 2&gt;/dev/null)" == true ]] || {</w:t>
+              <w:br/>
+              <w:t xml:space="preserve">  echo "容器 $CONTAINER 未运行，请先启动该容器。"</w:t>
+              <w:br/>
+              <w:t xml:space="preserve">  exit 1</w:t>
+              <w:br/>
+              <w:t>}</w:t>
+              <w:br/>
+              <w:br/>
+              <w:t>MOUNT_SOURCE="$(docker inspect -f \</w:t>
+              <w:br/>
+              <w:t xml:space="preserve">  '{{range .Mounts}}{{if eq .Destination "/data"}}{{.Source}}{{end}}{{end}}' \</w:t>
+              <w:br/>
+              <w:t xml:space="preserve">  "$CONTAINER")"</w:t>
+              <w:br/>
+              <w:t>if [[ -z "$MOUNT_SOURCE" ||</w:t>
+              <w:br/>
+              <w:t xml:space="preserve">      "$(realpath -e "$MOUNT_SOURCE")" != "$DATA_ROOT" ]]; then</w:t>
+              <w:br/>
+              <w:t xml:space="preserve">  echo "容器 /data 挂载与工作站 DATA_ROOT 不一致，停止。"</w:t>
+              <w:br/>
+              <w:t xml:space="preserve">  echo "工作站 DATA_ROOT：$DATA_ROOT"</w:t>
+              <w:br/>
+              <w:t xml:space="preserve">  echo "容器挂载来源：$MOUNT_SOURCE"</w:t>
+              <w:br/>
+              <w:t xml:space="preserve">  exit 1</w:t>
+              <w:br/>
+              <w:t>fi</w:t>
+              <w:br/>
+              <w:br/>
+              <w:t># 每次建立新的独立运行目录；同名目录存在时 mkdir 会停止</w:t>
+              <w:br/>
+              <w:t>BAG_NAME="$(basename "$SOURCE_BAG")"</w:t>
+              <w:br/>
+              <w:t>BAG_BASE="${BAG_NAME%.bag}"</w:t>
+              <w:br/>
+              <w:t>RUN_DIR="$OUTPUT_ROOT/ds_joint_tests/$(date -u +%Y%m%dT%H%M%SZ)"</w:t>
+              <w:br/>
+              <w:t>mkdir -p "$OUTPUT_ROOT/ds_joint_tests"</w:t>
+              <w:br/>
+              <w:t>mkdir "$RUN_DIR"</w:t>
+              <w:br/>
+              <w:t>mkdir "$RUN_DIR/input_configs"</w:t>
+              <w:br/>
+              <w:br/>
+              <w:t># 自动将结果目录映射为容器内路径</w:t>
+              <w:br/>
+              <w:t>RUN_INNER="/data${RUN_DIR#"$DATA_ROOT"}"</w:t>
+              <w:br/>
+              <w:br/>
+              <w:t># 保存输入快照，后续只读取本次副本</w:t>
+              <w:br/>
+              <w:t>cp -v -- "$SOURCE_BAG" "$RUN_DIR/$BAG_NAME"</w:t>
+              <w:br/>
+              <w:t>cp -- "$CAMCHAIN" "$RUN_DIR/input_configs/camchain.yaml"</w:t>
+              <w:br/>
+              <w:t>cp -- "$IMU_YAML" "$RUN_DIR/input_configs/imu.yaml"</w:t>
+              <w:br/>
+              <w:t>cp -- "$TARGET" "$RUN_DIR/input_configs/target.yaml"</w:t>
+              <w:br/>
+              <w:br/>
+              <w:t># 校验每个副本，记录 SHA256</w:t>
+              <w:br/>
+              <w:t>check_copy() {</w:t>
+              <w:br/>
+              <w:t xml:space="preserve">  local ORIGINAL="$1" COPY="$2"</w:t>
+              <w:br/>
+              <w:t xml:space="preserve">  local ORIGINAL_SHA COPY_SHA</w:t>
+              <w:br/>
+              <w:t xml:space="preserve">  ORIGINAL_SHA="$(sha256sum "$ORIGINAL" | awk '{print $1}')"</w:t>
+              <w:br/>
+              <w:t xml:space="preserve">  COPY_SHA="$(sha256sum "$COPY" | awk '{print $1}')"</w:t>
+              <w:br/>
+              <w:t xml:space="preserve">  [[ "$ORIGINAL_SHA" == "$COPY_SHA" ]] || {</w:t>
+              <w:br/>
+              <w:t xml:space="preserve">    echo "副本校验失败：$COPY" &gt;&amp;2</w:t>
+              <w:br/>
+              <w:t xml:space="preserve">    exit 1</w:t>
+              <w:br/>
+              <w:t xml:space="preserve">  }</w:t>
+              <w:br/>
+              <w:t xml:space="preserve">  printf '%s  %s\n' "$COPY_SHA" "$COPY"</w:t>
+              <w:br/>
+              <w:t>}</w:t>
+              <w:br/>
+              <w:br/>
+              <w:t>{</w:t>
+              <w:br/>
+              <w:t xml:space="preserve">  check_copy "$SOURCE_BAG" "$RUN_DIR/$BAG_NAME"</w:t>
+              <w:br/>
+              <w:t xml:space="preserve">  check_copy "$CAMCHAIN" "$RUN_DIR/input_configs/camchain.yaml"</w:t>
+              <w:br/>
+              <w:t xml:space="preserve">  check_copy "$IMU_YAML" "$RUN_DIR/input_configs/imu.yaml"</w:t>
+              <w:br/>
+              <w:t xml:space="preserve">  check_copy "$TARGET" "$RUN_DIR/input_configs/target.yaml"</w:t>
+              <w:br/>
+              <w:t>} | tee "$RUN_DIR/input_sha256.txt"</w:t>
+              <w:br/>
+              <w:br/>
+              <w:t># 记录输入来源、容器身份和运行参数</w:t>
+              <w:br/>
+              <w:t>{</w:t>
+              <w:br/>
+              <w:t xml:space="preserve">  printf 'source_bag=%s\n' "$SOURCE_BAG"</w:t>
+              <w:br/>
+              <w:t xml:space="preserve">  printf 'camera_chain_source=%s\n' "$CAMCHAIN"</w:t>
+              <w:br/>
+              <w:t xml:space="preserve">  printf 'imu_config_source=%s\n' "$IMU_YAML"</w:t>
+              <w:br/>
+              <w:t xml:space="preserve">  printf 'target_source=%s\n' "$TARGET"</w:t>
+              <w:br/>
+              <w:t xml:space="preserve">  printf 'output_directory=%s\n' "$RUN_DIR"</w:t>
+              <w:br/>
+              <w:t xml:space="preserve">  printf 'container_name=%s\n' "$CONTAINER"</w:t>
+              <w:br/>
+              <w:t xml:space="preserve">  printf 'container_id=%s\n' "$(docker inspect -f '{{.Id}}' "$CONTAINER")"</w:t>
+              <w:br/>
+              <w:t xml:space="preserve">  printf 'bag_frequency_hz=%s\n' "$BAG_FREQ_HZ"</w:t>
+              <w:br/>
+              <w:t xml:space="preserve">  printf 'timeoffset_padding=Kalibr_default\n'</w:t>
+              <w:br/>
+              <w:t xml:space="preserve">  printf 'start_utc=%s\n' "$(date -u +%Y-%m-%dT%H:%M:%SZ)"</w:t>
+              <w:br/>
+              <w:t>} &gt; "$RUN_DIR/run_metadata.txt"</w:t>
+              <w:br/>
+              <w:br/>
+              <w:t>echo</w:t>
+              <w:br/>
+              <w:t>echo "本次动态 BAG：$SOURCE_BAG"</w:t>
+              <w:br/>
+              <w:t>echo "第一步相机链：$CAMCHAIN"</w:t>
+              <w:br/>
+              <w:t>echo "第二步 IMU 参数：$IMU_YAML"</w:t>
+              <w:br/>
+              <w:t>echo "本次结果目录：$RUN_DIR"</w:t>
+              <w:br/>
+              <w:t>echo "运行期间请保持终端打开。"</w:t>
+              <w:br/>
+              <w:br/>
+              <w:t># 捕获标定退出码，同时保存完整终端日志</w:t>
+              <w:br/>
+              <w:t>set +e</w:t>
+              <w:br/>
+              <w:t>docker exec -i \</w:t>
+              <w:br/>
+              <w:t xml:space="preserve">  -e RUN_INNER="$RUN_INNER" \</w:t>
+              <w:br/>
+              <w:t xml:space="preserve">  -e BAG_NAME="$BAG_NAME" \</w:t>
+              <w:br/>
+              <w:t xml:space="preserve">  -e BAG_FREQ_HZ="$BAG_FREQ_HZ" \</w:t>
+              <w:br/>
+              <w:t xml:space="preserve">  "$CONTAINER" bash -s &lt;&lt;'CONTAINER_SCRIPT' 2&gt;&amp;1 | tee "$RUN_DIR/run.log"</w:t>
+              <w:br/>
+              <w:t>set -e</w:t>
+              <w:br/>
+              <w:t>source /opt/ros/noetic/setup.bash</w:t>
+              <w:br/>
+              <w:t>source /catkin_ws/devel/setup.bash</w:t>
+              <w:br/>
+              <w:t>export MPLBACKEND=Agg</w:t>
+              <w:br/>
+              <w:t>unset DISPLAY</w:t>
+              <w:br/>
+              <w:br/>
+              <w:t>cd "$RUN_INNER"</w:t>
+              <w:br/>
+              <w:t>export BAG_PATH="$RUN_INNER/$BAG_NAME"</w:t>
+              <w:br/>
+              <w:br/>
+              <w:t>echo "=== 检查输入模型、Topic 和 IMU 参数 ==="</w:t>
+              <w:br/>
+              <w:t>python3 - &lt;&lt;'PY'</w:t>
+              <w:br/>
+              <w:t>import os</w:t>
+              <w:br/>
+              <w:t>import math</w:t>
+              <w:br/>
+              <w:t>import yaml</w:t>
+              <w:br/>
+              <w:t>import rosbag</w:t>
+              <w:br/>
+              <w:br/>
+              <w:t>root = os.environ["RUN_INNER"]</w:t>
+              <w:br/>
+              <w:t>expected = [</w:t>
+              <w:br/>
+              <w:t xml:space="preserve">    "/fisheye/left/image_raw/compressed",</w:t>
+              <w:br/>
+              <w:t xml:space="preserve">    "/fisheye/right/image_raw/compressed",</w:t>
+              <w:br/>
+              <w:t xml:space="preserve">    "/fisheye/bright/image_raw/compressed",</w:t>
+              <w:br/>
+              <w:t xml:space="preserve">    "/fisheye/bleft/image_raw/compressed",</w:t>
+              <w:br/>
+              <w:t>]</w:t>
+              <w:br/>
+              <w:br/>
+              <w:t>with open(root + "/input_configs/camchain.yaml") as f:</w:t>
+              <w:br/>
+              <w:t xml:space="preserve">    cams = yaml.safe_load(f)</w:t>
+              <w:br/>
+              <w:t>camera_keys = [</w:t>
+              <w:br/>
+              <w:t xml:space="preserve">    k for k in cams</w:t>
+              <w:br/>
+              <w:t xml:space="preserve">    if isinstance(k, str) and k.startswith("cam") and k[3:].isdigit()</w:t>
+              <w:br/>
+              <w:t>]</w:t>
+              <w:br/>
+              <w:t>if sorted(camera_keys) != ["cam0", "cam1", "cam2", "cam3"]:</w:t>
+              <w:br/>
+              <w:t xml:space="preserve">    raise RuntimeError("相机链必须包含 cam0 到 cam3 四路")</w:t>
+              <w:br/>
+              <w:br/>
+              <w:t>for index, topic in enumerate(expected):</w:t>
+              <w:br/>
+              <w:t xml:space="preserve">    cam = cams["cam%d" % index]</w:t>
+              <w:br/>
+              <w:t xml:space="preserve">    if cam.get("camera_model") != "ds":</w:t>
+              <w:br/>
+              <w:t xml:space="preserve">        raise RuntimeError("相机模型不是 DS：cam%d" % index)</w:t>
+              <w:br/>
+              <w:t xml:space="preserve">    if cam.get("distortion_model") != "none":</w:t>
+              <w:br/>
+              <w:t xml:space="preserve">        raise RuntimeError("畸变模型不是 none：cam%d" % index)</w:t>
+              <w:br/>
+              <w:t xml:space="preserve">    if cam.get("rostopic") != topic:</w:t>
+              <w:br/>
+              <w:t xml:space="preserve">        raise RuntimeError("相机链 Topic 顺序不匹配：cam%d" % index)</w:t>
+              <w:br/>
+              <w:br/>
+              <w:t>with open(root + "/input_configs/imu.yaml") as f:</w:t>
+              <w:br/>
+              <w:t xml:space="preserve">    imu = yaml.safe_load(f)</w:t>
+              <w:br/>
+              <w:t>if imu.get("rostopic") != "/imu_data_raw":</w:t>
+              <w:br/>
+              <w:t xml:space="preserve">    raise RuntimeError("IMU 配置 Topic 必须为 /imu_data_raw")</w:t>
+              <w:br/>
+              <w:br/>
+              <w:t>for key in (</w:t>
+              <w:br/>
+              <w:t xml:space="preserve">    "accelerometer_noise_density", "accelerometer_random_walk",</w:t>
+              <w:br/>
+              <w:t xml:space="preserve">    "gyroscope_noise_density", "gyroscope_random_walk", "update_rate",</w:t>
+              <w:br/>
+              <w:t>):</w:t>
+              <w:br/>
+              <w:t xml:space="preserve">    value = float(imu[key])</w:t>
+              <w:br/>
+              <w:t xml:space="preserve">    if not math.isfinite(value) or value &lt;= 0:</w:t>
+              <w:br/>
+              <w:t xml:space="preserve">        raise RuntimeError("IMU 参数不是有限正数：" + key)</w:t>
+              <w:br/>
+              <w:br/>
+              <w:t>with rosbag.Bag(os.environ["BAG_PATH"], "r") as bag:</w:t>
+              <w:br/>
+              <w:t xml:space="preserve">    topics = bag.get_type_and_topic_info().topics</w:t>
+              <w:br/>
+              <w:t xml:space="preserve">    for topic in expected + ["/imu_data_raw"]:</w:t>
+              <w:br/>
+              <w:t xml:space="preserve">        if topic not in topics or topics[topic].message_count == 0:</w:t>
+              <w:br/>
+              <w:t xml:space="preserve">            raise RuntimeError("BAG 缺少数据：" + topic)</w:t>
+              <w:br/>
+              <w:t xml:space="preserve">        wanted = (</w:t>
+              <w:br/>
+              <w:t xml:space="preserve">            "sensor_msgs/Imu" if topic == "/imu_data_raw"</w:t>
+              <w:br/>
+              <w:t xml:space="preserve">            else "sensor_msgs/CompressedImage"</w:t>
+              <w:br/>
+              <w:t xml:space="preserve">        )</w:t>
+              <w:br/>
+              <w:t xml:space="preserve">        if topics[topic].msg_type != wanted:</w:t>
+              <w:br/>
+              <w:t xml:space="preserve">            raise RuntimeError("BAG 消息类型不匹配：" + topic)</w:t>
+              <w:br/>
+              <w:br/>
+              <w:t>print("输入结构检查通过。")</w:t>
+              <w:br/>
+              <w:t>print("本次 IMU 参数：")</w:t>
+              <w:br/>
+              <w:t>print(yaml.safe_dump(imu, sort_keys=False))</w:t>
+              <w:br/>
+              <w:t>PY</w:t>
+              <w:br/>
+              <w:br/>
+              <w:t>rosbag info "$BAG_PATH" | tee "$RUN_INNER/bag_info.txt"</w:t>
+              <w:br/>
+              <w:t>git -C /catkin_ws/src/kalibr rev-parse HEAD \</w:t>
+              <w:br/>
+              <w:t xml:space="preserve">  &gt; "$RUN_INNER/kalibr_source_commit.txt"</w:t>
+              <w:br/>
+              <w:br/>
+              <w:t>echo "=== 开始 Camera-IMU 联合标定 ==="</w:t>
+              <w:br/>
+              <w:t># real/user/sys 由容器内实际标定进程计时，记录在 run.log 中</w:t>
+              <w:br/>
+              <w:t>TIMEFORMAT=$'real %3R\nuser %3U\nsys %3S'</w:t>
+              <w:br/>
+              <w:t>time rosrun kalibr kalibr_calibrate_imu_camera \</w:t>
+              <w:br/>
+              <w:t xml:space="preserve">  --target "$RUN_INNER/input_configs/target.yaml" \</w:t>
+              <w:br/>
+              <w:t xml:space="preserve">  --imu "$RUN_INNER/input_configs/imu.yaml" \</w:t>
+              <w:br/>
+              <w:t xml:space="preserve">  --cams "$RUN_INNER/input_configs/camchain.yaml" \</w:t>
+              <w:br/>
+              <w:t xml:space="preserve">  --bag "$BAG_PATH" \</w:t>
+              <w:br/>
+              <w:t xml:space="preserve">  --bag-freq "$BAG_FREQ_HZ"</w:t>
+              <w:br/>
+              <w:t>CONTAINER_SCRIPT</w:t>
+              <w:br/>
+              <w:br/>
+              <w:t>PIPE_RESULTS=("${PIPESTATUS[@]}")</w:t>
+              <w:br/>
+              <w:t>CALIBRATION_RC="${PIPE_RESULTS[0]}"</w:t>
+              <w:br/>
+              <w:t>LOG_RC="${PIPE_RESULTS[1]}"</w:t>
+              <w:br/>
+              <w:t>set -e</w:t>
+              <w:br/>
+              <w:br/>
+              <w:t># 检查本次独立目录中的四个结果文件</w:t>
+              <w:br/>
+              <w:t>FILES_COMPLETE=yes</w:t>
+              <w:br/>
+              <w:t>for SUFFIX in \</w:t>
+              <w:br/>
+              <w:t xml:space="preserve">  camchain-imucam.yaml \</w:t>
+              <w:br/>
+              <w:t xml:space="preserve">  imu.yaml \</w:t>
+              <w:br/>
+              <w:t xml:space="preserve">  results-imucam.txt \</w:t>
+              <w:br/>
+              <w:t xml:space="preserve">  report-imucam.pdf</w:t>
+              <w:br/>
+              <w:t>do</w:t>
+              <w:br/>
+              <w:t xml:space="preserve">  FILE="$RUN_DIR/${BAG_BASE}-$SUFFIX"</w:t>
+              <w:br/>
+              <w:t xml:space="preserve">  if [[ ! -s "$FILE" ]]; then</w:t>
+              <w:br/>
+              <w:t xml:space="preserve">    echo "缺少结果文件：$FILE"</w:t>
+              <w:br/>
+              <w:t xml:space="preserve">    FILES_COMPLETE=no</w:t>
+              <w:br/>
+              <w:t xml:space="preserve">  fi</w:t>
+              <w:br/>
+              <w:t>done</w:t>
+              <w:br/>
+              <w:br/>
+              <w:t>STATUS=INCOMPLETE_OR_FAILED</w:t>
+              <w:br/>
+              <w:t>if [[ "$CALIBRATION_RC" -eq 0 &amp;&amp;</w:t>
+              <w:br/>
+              <w:t xml:space="preserve">      "$LOG_RC" -eq 0 &amp;&amp;</w:t>
+              <w:br/>
+              <w:t xml:space="preserve">      "$FILES_COMPLETE" == yes ]]; then</w:t>
+              <w:br/>
+              <w:t xml:space="preserve">  STATUS=SUCCESS_COMPLETE</w:t>
+              <w:br/>
+              <w:t>fi</w:t>
+              <w:br/>
+              <w:br/>
+              <w:t>{</w:t>
+              <w:br/>
+              <w:t xml:space="preserve">  printf 'end_utc=%s\n' "$(date -u +%Y-%m-%dT%H:%M:%SZ)"</w:t>
+              <w:br/>
+              <w:t xml:space="preserve">  printf 'total_wall_seconds=%s\n' "$(( $(date +%s) - TOTAL_START ))"</w:t>
+              <w:br/>
+              <w:t xml:space="preserve">  printf 'kalibr_exit_code=%s\n' "$CALIBRATION_RC"</w:t>
+              <w:br/>
+              <w:t xml:space="preserve">  printf 'log_exit_code=%s\n' "$LOG_RC"</w:t>
+              <w:br/>
+              <w:t xml:space="preserve">  printf 'status=%s\n' "$STATUS"</w:t>
+              <w:br/>
+              <w:t>} | tee -a "$RUN_DIR/run_metadata.txt"</w:t>
+              <w:br/>
+              <w:br/>
+              <w:t>echo</w:t>
+              <w:br/>
+              <w:t>ls -lh "$RUN_DIR"</w:t>
+              <w:br/>
+              <w:t>echo "状态：$STATUS"</w:t>
+              <w:br/>
+              <w:t>echo "结果目录：$RUN_DIR"</w:t>
+              <w:br/>
+              <w:br/>
+              <w:t>[[ "$STATUS" == SUCCESS_COMPLETE ]]</w:t>
+              <w:br/>
+            </w:r>
+            <w:r>
+              <w:rPr>
+                <w:rFonts w:eastAsia="Consolas" w:ascii="Consolas" w:cs="Consolas" w:hAnsi="Consolas"/>
+                <w:sz w:val="22"/>
+              </w:rPr>
+              <w:t>)</w:t>
+            </w:r>
+          </w:p>
+        </w:tc>
+      </w:tr>
+    </w:tbl>
+    <w:p>
+      <w:pPr>
+        <w:spacing w:before="120" w:after="120" w:line="288" w:lineRule="auto"/>
+        <w:ind w:left="0"/>
+        <w:jc w:val="left"/>
+      </w:pPr>
+    </w:p>
     <w:sectPr>
       <w:footerReference w:type="default" r:id="rId3"/>
-      <w:headerReference w:type="default" r:id="rId5"/>
+      <w:headerReference w:type="default" r:id="rId4"/>
       <w:pgSz w:orient="portrait" w:h="16840" w:w="11905"/>
     </w:sectPr>
   </w:body>

</xml_diff>